<commit_message>
suggested edits to ms and letter
</commit_message>
<xml_diff>
--- a/output/papers/Round 3/letter to the editors.docx
+++ b/output/papers/Round 3/letter to the editors.docx
@@ -1,6 +1,6 @@
 
 <file path=word/document.xml><?xml version="1.0" encoding="utf-8"?>
-<w:document xmlns:wpc="http://schemas.microsoft.com/office/word/2010/wordprocessingCanvas" xmlns:cx="http://schemas.microsoft.com/office/drawing/2014/chartex" xmlns:cx1="http://schemas.microsoft.com/office/drawing/2015/9/8/chartex" xmlns:cx2="http://schemas.microsoft.com/office/drawing/2015/10/21/chartex" xmlns:cx3="http://schemas.microsoft.com/office/drawing/2016/5/9/chartex" xmlns:cx4="http://schemas.microsoft.com/office/drawing/2016/5/10/chartex" xmlns:cx5="http://schemas.microsoft.com/office/drawing/2016/5/11/chartex" xmlns:cx6="http://schemas.microsoft.com/office/drawing/2016/5/12/chartex" xmlns:cx7="http://schemas.microsoft.com/office/drawing/2016/5/13/chartex" xmlns:cx8="http://schemas.microsoft.com/office/drawing/2016/5/14/chartex" xmlns:mc="http://schemas.openxmlformats.org/markup-compatibility/2006" xmlns:aink="http://schemas.microsoft.com/office/drawing/2016/ink" xmlns:am3d="http://schemas.microsoft.com/office/drawing/2017/model3d" xmlns:o="urn:schemas-microsoft-com:office:office" xmlns:oel="http://schemas.microsoft.com/office/2019/extlst" xmlns:r="http://schemas.openxmlformats.org/officeDocument/2006/relationships" xmlns:m="http://schemas.openxmlformats.org/officeDocument/2006/math" xmlns:v="urn:schemas-microsoft-com:vml" xmlns:wp14="http://schemas.microsoft.com/office/word/2010/wordprocessingDrawing" xmlns:wp="http://schemas.openxmlformats.org/drawingml/2006/wordprocessingDrawing" xmlns:w10="urn:schemas-microsoft-com:office:word" xmlns:w="http://schemas.openxmlformats.org/wordprocessingml/2006/main" xmlns:w14="http://schemas.microsoft.com/office/word/2010/wordml" xmlns:w15="http://schemas.microsoft.com/office/word/2012/wordml" xmlns:w16cex="http://schemas.microsoft.com/office/word/2018/wordml/cex" xmlns:w16cid="http://schemas.microsoft.com/office/word/2016/wordml/cid" xmlns:w16="http://schemas.microsoft.com/office/word/2018/wordml" xmlns:w16du="http://schemas.microsoft.com/office/word/2023/wordml/word16du" xmlns:w16sdtdh="http://schemas.microsoft.com/office/word/2020/wordml/sdtdatahash" xmlns:w16se="http://schemas.microsoft.com/office/word/2015/wordml/symex" xmlns:wpg="http://schemas.microsoft.com/office/word/2010/wordprocessingGroup" xmlns:wpi="http://schemas.microsoft.com/office/word/2010/wordprocessingInk" xmlns:wne="http://schemas.microsoft.com/office/word/2006/wordml" xmlns:wps="http://schemas.microsoft.com/office/word/2010/wordprocessingShape" mc:Ignorable="w14 w15 w16se w16cid w16 w16cex w16sdtdh w16du wp14">
+<w:document xmlns:wpc="http://schemas.microsoft.com/office/word/2010/wordprocessingCanvas" xmlns:cx="http://schemas.microsoft.com/office/drawing/2014/chartex" xmlns:cx1="http://schemas.microsoft.com/office/drawing/2015/9/8/chartex" xmlns:cx2="http://schemas.microsoft.com/office/drawing/2015/10/21/chartex" xmlns:cx3="http://schemas.microsoft.com/office/drawing/2016/5/9/chartex" xmlns:cx4="http://schemas.microsoft.com/office/drawing/2016/5/10/chartex" xmlns:cx5="http://schemas.microsoft.com/office/drawing/2016/5/11/chartex" xmlns:cx6="http://schemas.microsoft.com/office/drawing/2016/5/12/chartex" xmlns:cx7="http://schemas.microsoft.com/office/drawing/2016/5/13/chartex" xmlns:cx8="http://schemas.microsoft.com/office/drawing/2016/5/14/chartex" xmlns:mc="http://schemas.openxmlformats.org/markup-compatibility/2006" xmlns:aink="http://schemas.microsoft.com/office/drawing/2016/ink" xmlns:am3d="http://schemas.microsoft.com/office/drawing/2017/model3d" xmlns:o="urn:schemas-microsoft-com:office:office" xmlns:oel="http://schemas.microsoft.com/office/2019/extlst" xmlns:r="http://schemas.openxmlformats.org/officeDocument/2006/relationships" xmlns:m="http://schemas.openxmlformats.org/officeDocument/2006/math" xmlns:v="urn:schemas-microsoft-com:vml" xmlns:wp14="http://schemas.microsoft.com/office/word/2010/wordprocessingDrawing" xmlns:wp="http://schemas.openxmlformats.org/drawingml/2006/wordprocessingDrawing" xmlns:w10="urn:schemas-microsoft-com:office:word" xmlns:w="http://schemas.openxmlformats.org/wordprocessingml/2006/main" xmlns:w14="http://schemas.microsoft.com/office/word/2010/wordml" xmlns:w15="http://schemas.microsoft.com/office/word/2012/wordml" xmlns:w16cex="http://schemas.microsoft.com/office/word/2018/wordml/cex" xmlns:w16cid="http://schemas.microsoft.com/office/word/2016/wordml/cid" xmlns:w16="http://schemas.microsoft.com/office/word/2018/wordml" xmlns:w16du="http://schemas.microsoft.com/office/word/2023/wordml/word16du" xmlns:w16sdtdh="http://schemas.microsoft.com/office/word/2020/wordml/sdtdatahash" xmlns:w16sdtfl="http://schemas.microsoft.com/office/word/2024/wordml/sdtformatlock" xmlns:w16se="http://schemas.microsoft.com/office/word/2015/wordml/symex" xmlns:wpg="http://schemas.microsoft.com/office/word/2010/wordprocessingGroup" xmlns:wpi="http://schemas.microsoft.com/office/word/2010/wordprocessingInk" xmlns:wne="http://schemas.microsoft.com/office/word/2006/wordml" xmlns:wps="http://schemas.microsoft.com/office/word/2010/wordprocessingShape" mc:Ignorable="w14 w15 w16se w16cid w16 w16cex w16sdtdh w16sdtfl w16du wp14">
   <w:body>
     <w:p>
       <w:pPr>
@@ -36,6 +36,7 @@
         </w:rPr>
         <w:t xml:space="preserve">Editorial Board of </w:t>
       </w:r>
+      <w:proofErr w:type="gramStart"/>
       <w:r>
         <w:rPr>
           <w:rFonts w:ascii="Times New Roman" w:hAnsi="Times New Roman"/>
@@ -45,6 +46,7 @@
         </w:rPr>
         <w:t>JEP:LMC</w:t>
       </w:r>
+      <w:proofErr w:type="gramEnd"/>
     </w:p>
     <w:p>
       <w:pPr>
@@ -68,6 +70,7 @@
       <w:pPr>
         <w:ind w:firstLine="0"/>
         <w:rPr>
+          <w:ins w:id="0" w:author="Jaeger, Florian" w:date="2025-08-14T11:38:00Z" w16du:dateUtc="2025-08-14T09:38:00Z"/>
           <w:rFonts w:ascii="Times New Roman" w:hAnsi="Times New Roman"/>
           <w:sz w:val="22"/>
           <w:szCs w:val="22"/>
@@ -79,107 +82,338 @@
           <w:sz w:val="22"/>
           <w:szCs w:val="22"/>
         </w:rPr>
-        <w:t xml:space="preserve">We are resubmitting our manuscript (XLM-2025-0564), entitled “Compensation in audiovisual speech perception: discounting the pen in the mouth.” We are grateful to you and the reviewers for your highly constructive feedback on </w:t>
+        <w:t xml:space="preserve">We are resubmitting our manuscript (XLM-2025-0564), entitled “Compensation in audiovisual speech perception: discounting the pen in the mouth.” </w:t>
       </w:r>
+      <w:ins w:id="1" w:author="Jaeger, Florian" w:date="2025-08-14T11:36:00Z" w16du:dateUtc="2025-08-14T09:36:00Z">
+        <w:r>
+          <w:rPr>
+            <w:rFonts w:ascii="Times New Roman" w:hAnsi="Times New Roman"/>
+            <w:sz w:val="22"/>
+            <w:szCs w:val="22"/>
+          </w:rPr>
+          <w:t xml:space="preserve">We have removed the two typos identified by R2. </w:t>
+        </w:r>
+      </w:ins>
+    </w:p>
+    <w:p>
+      <w:pPr>
+        <w:ind w:firstLine="0"/>
+        <w:rPr>
+          <w:ins w:id="2" w:author="Jaeger, Florian" w:date="2025-08-14T11:38:00Z" w16du:dateUtc="2025-08-14T09:38:00Z"/>
+          <w:rFonts w:ascii="Times New Roman" w:hAnsi="Times New Roman"/>
+          <w:sz w:val="22"/>
+          <w:szCs w:val="22"/>
+        </w:rPr>
+      </w:pPr>
+    </w:p>
+    <w:p>
+      <w:pPr>
+        <w:ind w:firstLine="0"/>
+        <w:rPr>
+          <w:del w:id="3" w:author="Jaeger, Florian" w:date="2025-08-14T11:39:00Z" w16du:dateUtc="2025-08-14T09:39:00Z"/>
+          <w:rFonts w:ascii="Times New Roman" w:hAnsi="Times New Roman"/>
+          <w:sz w:val="22"/>
+          <w:szCs w:val="22"/>
+        </w:rPr>
+        <w:pPrChange w:id="4" w:author="Jaeger, Florian" w:date="2025-08-14T11:39:00Z" w16du:dateUtc="2025-08-14T09:39:00Z">
+          <w:pPr>
+            <w:ind w:firstLine="0"/>
+          </w:pPr>
+        </w:pPrChange>
+      </w:pPr>
+      <w:proofErr w:type="gramStart"/>
+      <w:ins w:id="5" w:author="Jaeger, Florian" w:date="2025-08-14T11:36:00Z" w16du:dateUtc="2025-08-14T09:36:00Z">
+        <w:r>
+          <w:rPr>
+            <w:rFonts w:ascii="Times New Roman" w:hAnsi="Times New Roman"/>
+            <w:sz w:val="22"/>
+            <w:szCs w:val="22"/>
+          </w:rPr>
+          <w:t xml:space="preserve">All </w:t>
+        </w:r>
+      </w:ins>
+      <w:ins w:id="6" w:author="Jaeger, Florian" w:date="2025-08-14T11:37:00Z" w16du:dateUtc="2025-08-14T09:37:00Z">
+        <w:r>
+          <w:rPr>
+            <w:rFonts w:ascii="Times New Roman" w:hAnsi="Times New Roman"/>
+            <w:sz w:val="22"/>
+            <w:szCs w:val="22"/>
+          </w:rPr>
+          <w:t>of</w:t>
+        </w:r>
+        <w:proofErr w:type="gramEnd"/>
+        <w:r>
+          <w:rPr>
+            <w:rFonts w:ascii="Times New Roman" w:hAnsi="Times New Roman"/>
+            <w:sz w:val="22"/>
+            <w:szCs w:val="22"/>
+          </w:rPr>
+          <w:t xml:space="preserve"> R2’s other</w:t>
+        </w:r>
+      </w:ins>
+      <w:ins w:id="7" w:author="Jaeger, Florian" w:date="2025-08-14T11:36:00Z" w16du:dateUtc="2025-08-14T09:36:00Z">
+        <w:r>
+          <w:rPr>
+            <w:rFonts w:ascii="Times New Roman" w:hAnsi="Times New Roman"/>
+            <w:sz w:val="22"/>
+            <w:szCs w:val="22"/>
+          </w:rPr>
+          <w:t xml:space="preserve"> comments related to our use of track-changes</w:t>
+        </w:r>
+      </w:ins>
+      <w:ins w:id="8" w:author="Jaeger, Florian" w:date="2025-08-14T11:37:00Z" w16du:dateUtc="2025-08-14T09:37:00Z">
+        <w:r>
+          <w:rPr>
+            <w:rFonts w:ascii="Times New Roman" w:hAnsi="Times New Roman"/>
+            <w:sz w:val="22"/>
+            <w:szCs w:val="22"/>
+          </w:rPr>
+          <w:t>, which we have now removed</w:t>
+        </w:r>
+      </w:ins>
+      <w:ins w:id="9" w:author="Jaeger, Florian" w:date="2025-08-14T11:38:00Z" w16du:dateUtc="2025-08-14T09:38:00Z">
+        <w:r>
+          <w:rPr>
+            <w:rFonts w:ascii="Times New Roman" w:hAnsi="Times New Roman"/>
+            <w:sz w:val="22"/>
+            <w:szCs w:val="22"/>
+          </w:rPr>
+          <w:t>. I</w:t>
+        </w:r>
+      </w:ins>
+      <w:ins w:id="10" w:author="Jaeger, Florian" w:date="2025-08-14T11:37:00Z" w16du:dateUtc="2025-08-14T09:37:00Z">
+        <w:r>
+          <w:rPr>
+            <w:rFonts w:ascii="Times New Roman" w:hAnsi="Times New Roman"/>
+            <w:sz w:val="22"/>
+            <w:szCs w:val="22"/>
+          </w:rPr>
+          <w:t xml:space="preserve">n particular, the revised result </w:t>
+        </w:r>
+      </w:ins>
+      <w:ins w:id="11" w:author="Jaeger, Florian" w:date="2025-08-14T11:38:00Z" w16du:dateUtc="2025-08-14T09:38:00Z">
+        <w:r>
+          <w:rPr>
+            <w:rFonts w:ascii="Times New Roman" w:hAnsi="Times New Roman"/>
+            <w:sz w:val="22"/>
+            <w:szCs w:val="22"/>
+          </w:rPr>
+          <w:t>Figure 4</w:t>
+        </w:r>
+      </w:ins>
+      <w:ins w:id="12" w:author="Jaeger, Florian" w:date="2025-08-14T11:37:00Z" w16du:dateUtc="2025-08-14T09:37:00Z">
+        <w:r>
+          <w:rPr>
+            <w:rFonts w:ascii="Times New Roman" w:hAnsi="Times New Roman"/>
+            <w:sz w:val="22"/>
+            <w:szCs w:val="22"/>
+          </w:rPr>
+          <w:t xml:space="preserve"> for Experiments 1a-c in our previous submission did </w:t>
+        </w:r>
+        <w:r>
+          <w:rPr>
+            <w:rFonts w:ascii="Times New Roman" w:hAnsi="Times New Roman"/>
+            <w:i/>
+            <w:iCs/>
+            <w:sz w:val="22"/>
+            <w:szCs w:val="22"/>
+          </w:rPr>
+          <w:t>not</w:t>
+        </w:r>
+        <w:r>
+          <w:rPr>
+            <w:rFonts w:ascii="Times New Roman" w:hAnsi="Times New Roman"/>
+            <w:sz w:val="22"/>
+            <w:szCs w:val="22"/>
+          </w:rPr>
+          <w:t xml:space="preserve"> contain the additional line that the reviewer was worried about; it had </w:t>
+        </w:r>
+      </w:ins>
+      <w:ins w:id="13" w:author="Jaeger, Florian" w:date="2025-08-14T11:38:00Z" w16du:dateUtc="2025-08-14T09:38:00Z">
+        <w:r>
+          <w:rPr>
+            <w:rFonts w:ascii="Times New Roman" w:hAnsi="Times New Roman"/>
+            <w:sz w:val="22"/>
+            <w:szCs w:val="22"/>
+          </w:rPr>
+          <w:t xml:space="preserve">already </w:t>
+        </w:r>
+      </w:ins>
+      <w:ins w:id="14" w:author="Jaeger, Florian" w:date="2025-08-14T11:37:00Z" w16du:dateUtc="2025-08-14T09:37:00Z">
+        <w:r>
+          <w:rPr>
+            <w:rFonts w:ascii="Times New Roman" w:hAnsi="Times New Roman"/>
+            <w:sz w:val="22"/>
+            <w:szCs w:val="22"/>
+          </w:rPr>
+          <w:t>been removed following R2</w:t>
+        </w:r>
+      </w:ins>
+      <w:ins w:id="15" w:author="Jaeger, Florian" w:date="2025-08-14T11:38:00Z" w16du:dateUtc="2025-08-14T09:38:00Z">
+        <w:r>
+          <w:rPr>
+            <w:rFonts w:ascii="Times New Roman" w:hAnsi="Times New Roman"/>
+            <w:sz w:val="22"/>
+            <w:szCs w:val="22"/>
+          </w:rPr>
+          <w:t>’s request</w:t>
+        </w:r>
+      </w:ins>
+      <w:ins w:id="16" w:author="Jaeger, Florian" w:date="2025-08-14T11:37:00Z" w16du:dateUtc="2025-08-14T09:37:00Z">
+        <w:r>
+          <w:rPr>
+            <w:rFonts w:ascii="Times New Roman" w:hAnsi="Times New Roman"/>
+            <w:sz w:val="22"/>
+            <w:szCs w:val="22"/>
+          </w:rPr>
+          <w:t>.</w:t>
+        </w:r>
+      </w:ins>
+      <w:del w:id="17" w:author="Jaeger, Florian" w:date="2025-08-14T11:35:00Z" w16du:dateUtc="2025-08-14T09:35:00Z">
+        <w:r>
+          <w:rPr>
+            <w:rFonts w:ascii="Times New Roman" w:hAnsi="Times New Roman"/>
+            <w:sz w:val="22"/>
+            <w:szCs w:val="22"/>
+          </w:rPr>
+          <w:delText xml:space="preserve">We are grateful to you and the reviewers for your highly constructive feedback on </w:delText>
+        </w:r>
+        <w:r>
+          <w:rPr>
+            <w:rFonts w:ascii="Times New Roman" w:hAnsi="Times New Roman"/>
+            <w:sz w:val="22"/>
+            <w:szCs w:val="22"/>
+          </w:rPr>
+          <w:delText xml:space="preserve">both </w:delText>
+        </w:r>
+        <w:r>
+          <w:rPr>
+            <w:rFonts w:ascii="Times New Roman" w:hAnsi="Times New Roman"/>
+            <w:sz w:val="22"/>
+            <w:szCs w:val="22"/>
+          </w:rPr>
+          <w:delText>our initial submission</w:delText>
+        </w:r>
+        <w:r>
+          <w:rPr>
+            <w:rFonts w:ascii="Times New Roman" w:hAnsi="Times New Roman"/>
+            <w:sz w:val="22"/>
+            <w:szCs w:val="22"/>
+          </w:rPr>
+          <w:delText xml:space="preserve"> and first revision</w:delText>
+        </w:r>
+        <w:r>
+          <w:rPr>
+            <w:rFonts w:ascii="Times New Roman" w:hAnsi="Times New Roman"/>
+            <w:sz w:val="22"/>
+            <w:szCs w:val="22"/>
+          </w:rPr>
+          <w:delText xml:space="preserve">. </w:delText>
+        </w:r>
+        <w:r>
+          <w:rPr>
+            <w:rFonts w:ascii="Times New Roman" w:hAnsi="Times New Roman"/>
+            <w:sz w:val="22"/>
+            <w:szCs w:val="22"/>
+          </w:rPr>
+          <w:delText xml:space="preserve">Additionally, we are heartened that both reviewers found our responses to their initial feedback to be helpful and thorough. </w:delText>
+        </w:r>
+      </w:del>
+      <w:ins w:id="18" w:author="Jaeger, Florian" w:date="2025-08-14T11:39:00Z" w16du:dateUtc="2025-08-14T09:39:00Z">
+        <w:r>
+          <w:rPr>
+            <w:rFonts w:ascii="Times New Roman" w:hAnsi="Times New Roman"/>
+            <w:sz w:val="22"/>
+            <w:szCs w:val="22"/>
+          </w:rPr>
+          <w:t xml:space="preserve"> </w:t>
+        </w:r>
+      </w:ins>
+    </w:p>
+    <w:p>
+      <w:pPr>
+        <w:ind w:firstLine="0"/>
+        <w:rPr>
+          <w:del w:id="19" w:author="Jaeger, Florian" w:date="2025-08-14T11:39:00Z" w16du:dateUtc="2025-08-14T09:39:00Z"/>
+          <w:rFonts w:ascii="Times New Roman" w:hAnsi="Times New Roman"/>
+          <w:sz w:val="22"/>
+          <w:szCs w:val="22"/>
+        </w:rPr>
+        <w:pPrChange w:id="20" w:author="Jaeger, Florian" w:date="2025-08-14T11:39:00Z" w16du:dateUtc="2025-08-14T09:39:00Z">
+          <w:pPr>
+            <w:ind w:firstLine="0"/>
+          </w:pPr>
+        </w:pPrChange>
+      </w:pPr>
+    </w:p>
+    <w:p>
+      <w:pPr>
+        <w:ind w:firstLine="0"/>
+        <w:rPr>
+          <w:rFonts w:ascii="Times New Roman" w:hAnsi="Times New Roman"/>
+          <w:sz w:val="22"/>
+          <w:szCs w:val="22"/>
+        </w:rPr>
+      </w:pPr>
+      <w:del w:id="21" w:author="Jaeger, Florian" w:date="2025-08-14T11:39:00Z" w16du:dateUtc="2025-08-14T09:39:00Z">
+        <w:r>
+          <w:rPr>
+            <w:rFonts w:ascii="Times New Roman" w:hAnsi="Times New Roman"/>
+            <w:sz w:val="22"/>
+            <w:szCs w:val="22"/>
+          </w:rPr>
+          <w:delText>R1 recommended the paper in its current form for publication. While R2 identified “</w:delText>
+        </w:r>
+        <w:r>
+          <w:rPr>
+            <w:rFonts w:ascii="Times New Roman" w:hAnsi="Times New Roman"/>
+            <w:sz w:val="22"/>
+            <w:szCs w:val="22"/>
+          </w:rPr>
+          <w:delText>no other substantial comments</w:delText>
+        </w:r>
+        <w:r>
+          <w:rPr>
+            <w:rFonts w:ascii="Times New Roman" w:hAnsi="Times New Roman"/>
+            <w:sz w:val="22"/>
+            <w:szCs w:val="22"/>
+          </w:rPr>
+          <w:delText>”, they did identify two typos and expressed some lack of clarity resultant of the tracked-changes document. We have amended the typos and removed the changes tracking from the revised submission, clarifying that</w:delText>
+        </w:r>
+        <w:r>
+          <w:rPr>
+            <w:rFonts w:ascii="Times New Roman" w:hAnsi="Times New Roman"/>
+            <w:sz w:val="22"/>
+            <w:szCs w:val="22"/>
+          </w:rPr>
+          <w:delText>, for example,</w:delText>
+        </w:r>
+        <w:r>
+          <w:rPr>
+            <w:rFonts w:ascii="Times New Roman" w:hAnsi="Times New Roman"/>
+            <w:sz w:val="22"/>
+            <w:szCs w:val="22"/>
+          </w:rPr>
+          <w:delText xml:space="preserve"> the revised Figure 4 does not include data from a previous experiment. Finally, we have</w:delText>
+        </w:r>
+      </w:del>
+      <w:ins w:id="22" w:author="Jaeger, Florian" w:date="2025-08-14T11:39:00Z" w16du:dateUtc="2025-08-14T09:39:00Z">
+        <w:r>
+          <w:rPr>
+            <w:rFonts w:ascii="Times New Roman" w:hAnsi="Times New Roman"/>
+            <w:sz w:val="22"/>
+            <w:szCs w:val="22"/>
+          </w:rPr>
+          <w:t>We also</w:t>
+        </w:r>
+      </w:ins>
       <w:r>
         <w:rPr>
           <w:rFonts w:ascii="Times New Roman" w:hAnsi="Times New Roman"/>
           <w:sz w:val="22"/>
           <w:szCs w:val="22"/>
         </w:rPr>
-        <w:t xml:space="preserve">both </w:t>
-      </w:r>
-      <w:r>
-        <w:rPr>
-          <w:rFonts w:ascii="Times New Roman" w:hAnsi="Times New Roman"/>
-          <w:sz w:val="22"/>
-          <w:szCs w:val="22"/>
-        </w:rPr>
-        <w:t>our initial submission</w:t>
-      </w:r>
-      <w:r>
-        <w:rPr>
-          <w:rFonts w:ascii="Times New Roman" w:hAnsi="Times New Roman"/>
-          <w:sz w:val="22"/>
-          <w:szCs w:val="22"/>
-        </w:rPr>
-        <w:t xml:space="preserve"> and first revision</w:t>
-      </w:r>
-      <w:r>
-        <w:rPr>
-          <w:rFonts w:ascii="Times New Roman" w:hAnsi="Times New Roman"/>
-          <w:sz w:val="22"/>
-          <w:szCs w:val="22"/>
-        </w:rPr>
-        <w:t xml:space="preserve">. </w:t>
-      </w:r>
-      <w:r>
-        <w:rPr>
-          <w:rFonts w:ascii="Times New Roman" w:hAnsi="Times New Roman"/>
-          <w:sz w:val="22"/>
-          <w:szCs w:val="22"/>
-        </w:rPr>
-        <w:t xml:space="preserve">Additionally, we are heartened that both reviewers found our responses to their initial feedback to be helpful and thorough. </w:t>
-      </w:r>
-    </w:p>
-    <w:p>
-      <w:pPr>
-        <w:ind w:firstLine="0"/>
-        <w:rPr>
-          <w:rFonts w:ascii="Times New Roman" w:hAnsi="Times New Roman"/>
-          <w:sz w:val="22"/>
-          <w:szCs w:val="22"/>
-        </w:rPr>
-      </w:pPr>
-    </w:p>
-    <w:p>
-      <w:pPr>
-        <w:ind w:firstLine="0"/>
-        <w:rPr>
-          <w:rFonts w:ascii="Times New Roman" w:hAnsi="Times New Roman"/>
-          <w:sz w:val="22"/>
-          <w:szCs w:val="22"/>
-        </w:rPr>
-      </w:pPr>
-      <w:r>
-        <w:rPr>
-          <w:rFonts w:ascii="Times New Roman" w:hAnsi="Times New Roman"/>
-          <w:sz w:val="22"/>
-          <w:szCs w:val="22"/>
-        </w:rPr>
-        <w:t>R1 recommended the paper in its current form for publication. While R2 identified “</w:t>
-      </w:r>
-      <w:r>
-        <w:rPr>
-          <w:rFonts w:ascii="Times New Roman" w:hAnsi="Times New Roman"/>
-          <w:sz w:val="22"/>
-          <w:szCs w:val="22"/>
-        </w:rPr>
-        <w:t>no other substantial comments</w:t>
-      </w:r>
-      <w:r>
-        <w:rPr>
-          <w:rFonts w:ascii="Times New Roman" w:hAnsi="Times New Roman"/>
-          <w:sz w:val="22"/>
-          <w:szCs w:val="22"/>
-        </w:rPr>
-        <w:t>”, they did identify two typos and expressed some lack of clarity resultant of the tracked-changes document. We have amended the typos and removed the changes tracking from the revised submission, clarifying that</w:t>
-      </w:r>
-      <w:r>
-        <w:rPr>
-          <w:rFonts w:ascii="Times New Roman" w:hAnsi="Times New Roman"/>
-          <w:sz w:val="22"/>
-          <w:szCs w:val="22"/>
-        </w:rPr>
-        <w:t>, for example,</w:t>
-      </w:r>
-      <w:r>
-        <w:rPr>
-          <w:rFonts w:ascii="Times New Roman" w:hAnsi="Times New Roman"/>
-          <w:sz w:val="22"/>
-          <w:szCs w:val="22"/>
-        </w:rPr>
-        <w:t xml:space="preserve"> the revised Figure 4 does not include data from a previous experiment. Finally, we have clarified footnote </w:t>
+        <w:t xml:space="preserve"> clarified footnote </w:t>
       </w:r>
       <w:r>
         <w:rPr>
@@ -189,6 +423,86 @@
         </w:rPr>
         <w:t>4 in terms of the differences between the present work and the approach taken in Liu &amp; Jaeger (2018).</w:t>
       </w:r>
+      <w:ins w:id="23" w:author="Jaeger, Florian" w:date="2025-08-14T11:55:00Z" w16du:dateUtc="2025-08-14T09:55:00Z">
+        <w:r>
+          <w:rPr>
+            <w:rFonts w:ascii="Times New Roman" w:hAnsi="Times New Roman"/>
+            <w:sz w:val="22"/>
+            <w:szCs w:val="22"/>
+          </w:rPr>
+          <w:t xml:space="preserve"> Finally, we made some </w:t>
+        </w:r>
+        <w:r>
+          <w:rPr>
+            <w:rFonts w:ascii="Times New Roman" w:hAnsi="Times New Roman"/>
+            <w:sz w:val="22"/>
+            <w:szCs w:val="22"/>
+          </w:rPr>
+          <w:t>very</w:t>
+        </w:r>
+        <w:r>
+          <w:rPr>
+            <w:rFonts w:ascii="Times New Roman" w:hAnsi="Times New Roman"/>
+            <w:sz w:val="22"/>
+            <w:szCs w:val="22"/>
+          </w:rPr>
+          <w:t xml:space="preserve"> minor rewording changes in the introduction and discussion to </w:t>
+        </w:r>
+      </w:ins>
+      <w:ins w:id="24" w:author="Jaeger, Florian" w:date="2025-08-14T11:56:00Z" w16du:dateUtc="2025-08-14T09:56:00Z">
+        <w:r>
+          <w:rPr>
+            <w:rFonts w:ascii="Times New Roman" w:hAnsi="Times New Roman"/>
+            <w:sz w:val="22"/>
+            <w:szCs w:val="22"/>
+          </w:rPr>
+          <w:t>remove ambiguity that we were made aware of by other readers</w:t>
+        </w:r>
+      </w:ins>
+      <w:ins w:id="25" w:author="Jaeger, Florian" w:date="2025-08-14T11:57:00Z" w16du:dateUtc="2025-08-14T09:57:00Z">
+        <w:r>
+          <w:rPr>
+            <w:rFonts w:ascii="Times New Roman" w:hAnsi="Times New Roman"/>
+            <w:sz w:val="22"/>
+            <w:szCs w:val="22"/>
+          </w:rPr>
+          <w:t xml:space="preserve"> (1</w:t>
+        </w:r>
+        <w:r>
+          <w:rPr>
+            <w:rFonts w:ascii="Times New Roman" w:hAnsi="Times New Roman"/>
+            <w:sz w:val="22"/>
+            <w:szCs w:val="22"/>
+            <w:vertAlign w:val="superscript"/>
+            <w:rPrChange w:id="26" w:author="Jaeger, Florian" w:date="2025-08-14T11:57:00Z" w16du:dateUtc="2025-08-14T09:57:00Z">
+              <w:rPr>
+                <w:rFonts w:ascii="Times New Roman" w:hAnsi="Times New Roman"/>
+                <w:sz w:val="22"/>
+                <w:szCs w:val="22"/>
+              </w:rPr>
+            </w:rPrChange>
+          </w:rPr>
+          <w:t>st</w:t>
+        </w:r>
+        <w:r>
+          <w:rPr>
+            <w:rFonts w:ascii="Times New Roman" w:hAnsi="Times New Roman"/>
+            <w:sz w:val="22"/>
+            <w:szCs w:val="22"/>
+          </w:rPr>
+          <w:t xml:space="preserve"> paragraph on p4, last paragraph on p. 30)</w:t>
+        </w:r>
+      </w:ins>
+      <w:ins w:id="27" w:author="Jaeger, Florian" w:date="2025-08-14T11:56:00Z" w16du:dateUtc="2025-08-14T09:56:00Z">
+        <w:r>
+          <w:rPr>
+            <w:rFonts w:ascii="Times New Roman" w:hAnsi="Times New Roman"/>
+            <w:sz w:val="22"/>
+            <w:szCs w:val="22"/>
+          </w:rPr>
+          <w:t>.</w:t>
+        </w:r>
+      </w:ins>
     </w:p>
     <w:p>
       <w:pPr>
@@ -217,6 +531,26 @@
         </w:rPr>
         <w:t xml:space="preserve">We appreciate the opportunity to strengthen this paper further, and hope this revised manuscript is now suitable for publication. </w:t>
       </w:r>
+      <w:ins w:id="28" w:author="Jaeger, Florian" w:date="2025-08-14T11:57:00Z" w16du:dateUtc="2025-08-14T09:57:00Z">
+        <w:r>
+          <w:rPr>
+            <w:rFonts w:ascii="Times New Roman" w:hAnsi="Times New Roman"/>
+            <w:sz w:val="22"/>
+            <w:szCs w:val="22"/>
+          </w:rPr>
+          <w:t>We thank you and the reviewers for the helpful gu</w:t>
+        </w:r>
+      </w:ins>
+      <w:ins w:id="29" w:author="Jaeger, Florian" w:date="2025-08-14T11:58:00Z" w16du:dateUtc="2025-08-14T09:58:00Z">
+        <w:r>
+          <w:rPr>
+            <w:rFonts w:ascii="Times New Roman" w:hAnsi="Times New Roman"/>
+            <w:sz w:val="22"/>
+            <w:szCs w:val="22"/>
+          </w:rPr>
+          <w:t>idance throughout the process.</w:t>
+        </w:r>
+      </w:ins>
     </w:p>
     <w:p>
       <w:pPr>
@@ -271,25 +605,7 @@
           <w:sz w:val="22"/>
           <w:szCs w:val="22"/>
         </w:rPr>
-        <w:t xml:space="preserve">Shawn Cummings, </w:t>
-      </w:r>
-      <w:proofErr w:type="spellStart"/>
-      <w:r>
-        <w:rPr>
-          <w:rFonts w:ascii="Times New Roman" w:hAnsi="Times New Roman"/>
-          <w:sz w:val="22"/>
-          <w:szCs w:val="22"/>
-        </w:rPr>
-        <w:t>Gevher</w:t>
-      </w:r>
-      <w:proofErr w:type="spellEnd"/>
-      <w:r>
-        <w:rPr>
-          <w:rFonts w:ascii="Times New Roman" w:hAnsi="Times New Roman"/>
-          <w:sz w:val="22"/>
-          <w:szCs w:val="22"/>
-        </w:rPr>
-        <w:t xml:space="preserve"> </w:t>
+        <w:t xml:space="preserve">Shawn Cummings, Gevher </w:t>
       </w:r>
       <w:proofErr w:type="spellStart"/>
       <w:r>
@@ -307,25 +623,7 @@
           <w:sz w:val="22"/>
           <w:szCs w:val="22"/>
         </w:rPr>
-        <w:t xml:space="preserve">, </w:t>
-      </w:r>
-      <w:proofErr w:type="spellStart"/>
-      <w:r>
-        <w:rPr>
-          <w:rFonts w:ascii="Times New Roman" w:hAnsi="Times New Roman"/>
-          <w:sz w:val="22"/>
-          <w:szCs w:val="22"/>
-        </w:rPr>
-        <w:t>Menghan</w:t>
-      </w:r>
-      <w:proofErr w:type="spellEnd"/>
-      <w:r>
-        <w:rPr>
-          <w:rFonts w:ascii="Times New Roman" w:hAnsi="Times New Roman"/>
-          <w:sz w:val="22"/>
-          <w:szCs w:val="22"/>
-        </w:rPr>
-        <w:t xml:space="preserve"> Yang, and </w:t>
+        <w:t xml:space="preserve">, Menghan Yang, and </w:t>
       </w:r>
       <w:r>
         <w:rPr>
@@ -389,7 +687,7 @@
 </file>
 
 <file path=word/endnotes.xml><?xml version="1.0" encoding="utf-8"?>
-<w:endnotes xmlns:wpc="http://schemas.microsoft.com/office/word/2010/wordprocessingCanvas" xmlns:cx="http://schemas.microsoft.com/office/drawing/2014/chartex" xmlns:cx1="http://schemas.microsoft.com/office/drawing/2015/9/8/chartex" xmlns:cx2="http://schemas.microsoft.com/office/drawing/2015/10/21/chartex" xmlns:cx3="http://schemas.microsoft.com/office/drawing/2016/5/9/chartex" xmlns:cx4="http://schemas.microsoft.com/office/drawing/2016/5/10/chartex" xmlns:cx5="http://schemas.microsoft.com/office/drawing/2016/5/11/chartex" xmlns:cx6="http://schemas.microsoft.com/office/drawing/2016/5/12/chartex" xmlns:cx7="http://schemas.microsoft.com/office/drawing/2016/5/13/chartex" xmlns:cx8="http://schemas.microsoft.com/office/drawing/2016/5/14/chartex" xmlns:mc="http://schemas.openxmlformats.org/markup-compatibility/2006" xmlns:aink="http://schemas.microsoft.com/office/drawing/2016/ink" xmlns:am3d="http://schemas.microsoft.com/office/drawing/2017/model3d" xmlns:o="urn:schemas-microsoft-com:office:office" xmlns:oel="http://schemas.microsoft.com/office/2019/extlst" xmlns:r="http://schemas.openxmlformats.org/officeDocument/2006/relationships" xmlns:m="http://schemas.openxmlformats.org/officeDocument/2006/math" xmlns:v="urn:schemas-microsoft-com:vml" xmlns:wp14="http://schemas.microsoft.com/office/word/2010/wordprocessingDrawing" xmlns:wp="http://schemas.openxmlformats.org/drawingml/2006/wordprocessingDrawing" xmlns:w10="urn:schemas-microsoft-com:office:word" xmlns:w="http://schemas.openxmlformats.org/wordprocessingml/2006/main" xmlns:w14="http://schemas.microsoft.com/office/word/2010/wordml" xmlns:w15="http://schemas.microsoft.com/office/word/2012/wordml" xmlns:w16cex="http://schemas.microsoft.com/office/word/2018/wordml/cex" xmlns:w16cid="http://schemas.microsoft.com/office/word/2016/wordml/cid" xmlns:w16="http://schemas.microsoft.com/office/word/2018/wordml" xmlns:w16du="http://schemas.microsoft.com/office/word/2023/wordml/word16du" xmlns:w16sdtdh="http://schemas.microsoft.com/office/word/2020/wordml/sdtdatahash" xmlns:w16se="http://schemas.microsoft.com/office/word/2015/wordml/symex" xmlns:wpg="http://schemas.microsoft.com/office/word/2010/wordprocessingGroup" xmlns:wpi="http://schemas.microsoft.com/office/word/2010/wordprocessingInk" xmlns:wne="http://schemas.microsoft.com/office/word/2006/wordml" xmlns:wps="http://schemas.microsoft.com/office/word/2010/wordprocessingShape" mc:Ignorable="w14 w15 w16se w16cid w16 w16cex w16sdtdh w16du wp14">
+<w:endnotes xmlns:wpc="http://schemas.microsoft.com/office/word/2010/wordprocessingCanvas" xmlns:cx="http://schemas.microsoft.com/office/drawing/2014/chartex" xmlns:cx1="http://schemas.microsoft.com/office/drawing/2015/9/8/chartex" xmlns:cx2="http://schemas.microsoft.com/office/drawing/2015/10/21/chartex" xmlns:cx3="http://schemas.microsoft.com/office/drawing/2016/5/9/chartex" xmlns:cx4="http://schemas.microsoft.com/office/drawing/2016/5/10/chartex" xmlns:cx5="http://schemas.microsoft.com/office/drawing/2016/5/11/chartex" xmlns:cx6="http://schemas.microsoft.com/office/drawing/2016/5/12/chartex" xmlns:cx7="http://schemas.microsoft.com/office/drawing/2016/5/13/chartex" xmlns:cx8="http://schemas.microsoft.com/office/drawing/2016/5/14/chartex" xmlns:mc="http://schemas.openxmlformats.org/markup-compatibility/2006" xmlns:aink="http://schemas.microsoft.com/office/drawing/2016/ink" xmlns:am3d="http://schemas.microsoft.com/office/drawing/2017/model3d" xmlns:o="urn:schemas-microsoft-com:office:office" xmlns:oel="http://schemas.microsoft.com/office/2019/extlst" xmlns:r="http://schemas.openxmlformats.org/officeDocument/2006/relationships" xmlns:m="http://schemas.openxmlformats.org/officeDocument/2006/math" xmlns:v="urn:schemas-microsoft-com:vml" xmlns:wp14="http://schemas.microsoft.com/office/word/2010/wordprocessingDrawing" xmlns:wp="http://schemas.openxmlformats.org/drawingml/2006/wordprocessingDrawing" xmlns:w10="urn:schemas-microsoft-com:office:word" xmlns:w="http://schemas.openxmlformats.org/wordprocessingml/2006/main" xmlns:w14="http://schemas.microsoft.com/office/word/2010/wordml" xmlns:w15="http://schemas.microsoft.com/office/word/2012/wordml" xmlns:w16cex="http://schemas.microsoft.com/office/word/2018/wordml/cex" xmlns:w16cid="http://schemas.microsoft.com/office/word/2016/wordml/cid" xmlns:w16="http://schemas.microsoft.com/office/word/2018/wordml" xmlns:w16du="http://schemas.microsoft.com/office/word/2023/wordml/word16du" xmlns:w16sdtdh="http://schemas.microsoft.com/office/word/2020/wordml/sdtdatahash" xmlns:w16sdtfl="http://schemas.microsoft.com/office/word/2024/wordml/sdtformatlock" xmlns:w16se="http://schemas.microsoft.com/office/word/2015/wordml/symex" xmlns:wpg="http://schemas.microsoft.com/office/word/2010/wordprocessingGroup" xmlns:wpi="http://schemas.microsoft.com/office/word/2010/wordprocessingInk" xmlns:wne="http://schemas.microsoft.com/office/word/2006/wordml" xmlns:wps="http://schemas.microsoft.com/office/word/2010/wordprocessingShape" mc:Ignorable="w14 w15 w16se w16cid w16 w16cex w16sdtdh w16sdtfl w16du wp14">
   <w:endnote w:type="separator" w:id="-1">
     <w:p>
       <w:r>
@@ -408,7 +706,7 @@
 </file>
 
 <file path=word/footer1.xml><?xml version="1.0" encoding="utf-8"?>
-<w:ftr xmlns:wpc="http://schemas.microsoft.com/office/word/2010/wordprocessingCanvas" xmlns:cx="http://schemas.microsoft.com/office/drawing/2014/chartex" xmlns:cx1="http://schemas.microsoft.com/office/drawing/2015/9/8/chartex" xmlns:cx2="http://schemas.microsoft.com/office/drawing/2015/10/21/chartex" xmlns:cx3="http://schemas.microsoft.com/office/drawing/2016/5/9/chartex" xmlns:cx4="http://schemas.microsoft.com/office/drawing/2016/5/10/chartex" xmlns:cx5="http://schemas.microsoft.com/office/drawing/2016/5/11/chartex" xmlns:cx6="http://schemas.microsoft.com/office/drawing/2016/5/12/chartex" xmlns:cx7="http://schemas.microsoft.com/office/drawing/2016/5/13/chartex" xmlns:cx8="http://schemas.microsoft.com/office/drawing/2016/5/14/chartex" xmlns:mc="http://schemas.openxmlformats.org/markup-compatibility/2006" xmlns:aink="http://schemas.microsoft.com/office/drawing/2016/ink" xmlns:am3d="http://schemas.microsoft.com/office/drawing/2017/model3d" xmlns:o="urn:schemas-microsoft-com:office:office" xmlns:oel="http://schemas.microsoft.com/office/2019/extlst" xmlns:r="http://schemas.openxmlformats.org/officeDocument/2006/relationships" xmlns:m="http://schemas.openxmlformats.org/officeDocument/2006/math" xmlns:v="urn:schemas-microsoft-com:vml" xmlns:wp14="http://schemas.microsoft.com/office/word/2010/wordprocessingDrawing" xmlns:wp="http://schemas.openxmlformats.org/drawingml/2006/wordprocessingDrawing" xmlns:w10="urn:schemas-microsoft-com:office:word" xmlns:w="http://schemas.openxmlformats.org/wordprocessingml/2006/main" xmlns:w14="http://schemas.microsoft.com/office/word/2010/wordml" xmlns:w15="http://schemas.microsoft.com/office/word/2012/wordml" xmlns:w16cex="http://schemas.microsoft.com/office/word/2018/wordml/cex" xmlns:w16cid="http://schemas.microsoft.com/office/word/2016/wordml/cid" xmlns:w16="http://schemas.microsoft.com/office/word/2018/wordml" xmlns:w16du="http://schemas.microsoft.com/office/word/2023/wordml/word16du" xmlns:w16sdtdh="http://schemas.microsoft.com/office/word/2020/wordml/sdtdatahash" xmlns:w16se="http://schemas.microsoft.com/office/word/2015/wordml/symex" xmlns:wpg="http://schemas.microsoft.com/office/word/2010/wordprocessingGroup" xmlns:wpi="http://schemas.microsoft.com/office/word/2010/wordprocessingInk" xmlns:wne="http://schemas.microsoft.com/office/word/2006/wordml" xmlns:wps="http://schemas.microsoft.com/office/word/2010/wordprocessingShape" mc:Ignorable="w14 w15 w16se w16cid w16 w16cex w16sdtdh w16du wp14">
+<w:ftr xmlns:wpc="http://schemas.microsoft.com/office/word/2010/wordprocessingCanvas" xmlns:cx="http://schemas.microsoft.com/office/drawing/2014/chartex" xmlns:cx1="http://schemas.microsoft.com/office/drawing/2015/9/8/chartex" xmlns:cx2="http://schemas.microsoft.com/office/drawing/2015/10/21/chartex" xmlns:cx3="http://schemas.microsoft.com/office/drawing/2016/5/9/chartex" xmlns:cx4="http://schemas.microsoft.com/office/drawing/2016/5/10/chartex" xmlns:cx5="http://schemas.microsoft.com/office/drawing/2016/5/11/chartex" xmlns:cx6="http://schemas.microsoft.com/office/drawing/2016/5/12/chartex" xmlns:cx7="http://schemas.microsoft.com/office/drawing/2016/5/13/chartex" xmlns:cx8="http://schemas.microsoft.com/office/drawing/2016/5/14/chartex" xmlns:mc="http://schemas.openxmlformats.org/markup-compatibility/2006" xmlns:aink="http://schemas.microsoft.com/office/drawing/2016/ink" xmlns:am3d="http://schemas.microsoft.com/office/drawing/2017/model3d" xmlns:o="urn:schemas-microsoft-com:office:office" xmlns:oel="http://schemas.microsoft.com/office/2019/extlst" xmlns:r="http://schemas.openxmlformats.org/officeDocument/2006/relationships" xmlns:m="http://schemas.openxmlformats.org/officeDocument/2006/math" xmlns:v="urn:schemas-microsoft-com:vml" xmlns:wp14="http://schemas.microsoft.com/office/word/2010/wordprocessingDrawing" xmlns:wp="http://schemas.openxmlformats.org/drawingml/2006/wordprocessingDrawing" xmlns:w10="urn:schemas-microsoft-com:office:word" xmlns:w="http://schemas.openxmlformats.org/wordprocessingml/2006/main" xmlns:w14="http://schemas.microsoft.com/office/word/2010/wordml" xmlns:w15="http://schemas.microsoft.com/office/word/2012/wordml" xmlns:w16cex="http://schemas.microsoft.com/office/word/2018/wordml/cex" xmlns:w16cid="http://schemas.microsoft.com/office/word/2016/wordml/cid" xmlns:w16="http://schemas.microsoft.com/office/word/2018/wordml" xmlns:w16du="http://schemas.microsoft.com/office/word/2023/wordml/word16du" xmlns:w16sdtdh="http://schemas.microsoft.com/office/word/2020/wordml/sdtdatahash" xmlns:w16sdtfl="http://schemas.microsoft.com/office/word/2024/wordml/sdtformatlock" xmlns:w16se="http://schemas.microsoft.com/office/word/2015/wordml/symex" xmlns:wpg="http://schemas.microsoft.com/office/word/2010/wordprocessingGroup" xmlns:wpi="http://schemas.microsoft.com/office/word/2010/wordprocessingInk" xmlns:wne="http://schemas.microsoft.com/office/word/2006/wordml" xmlns:wps="http://schemas.microsoft.com/office/word/2010/wordprocessingShape" mc:Ignorable="w14 w15 w16se w16cid w16 w16cex w16sdtdh w16sdtfl w16du wp14">
   <w:p>
     <w:pPr>
       <w:pStyle w:val="Footer"/>
@@ -419,7 +717,7 @@
 </file>
 
 <file path=word/footer2.xml><?xml version="1.0" encoding="utf-8"?>
-<w:ftr xmlns:wpc="http://schemas.microsoft.com/office/word/2010/wordprocessingCanvas" xmlns:cx="http://schemas.microsoft.com/office/drawing/2014/chartex" xmlns:cx1="http://schemas.microsoft.com/office/drawing/2015/9/8/chartex" xmlns:cx2="http://schemas.microsoft.com/office/drawing/2015/10/21/chartex" xmlns:cx3="http://schemas.microsoft.com/office/drawing/2016/5/9/chartex" xmlns:cx4="http://schemas.microsoft.com/office/drawing/2016/5/10/chartex" xmlns:cx5="http://schemas.microsoft.com/office/drawing/2016/5/11/chartex" xmlns:cx6="http://schemas.microsoft.com/office/drawing/2016/5/12/chartex" xmlns:cx7="http://schemas.microsoft.com/office/drawing/2016/5/13/chartex" xmlns:cx8="http://schemas.microsoft.com/office/drawing/2016/5/14/chartex" xmlns:mc="http://schemas.openxmlformats.org/markup-compatibility/2006" xmlns:aink="http://schemas.microsoft.com/office/drawing/2016/ink" xmlns:am3d="http://schemas.microsoft.com/office/drawing/2017/model3d" xmlns:o="urn:schemas-microsoft-com:office:office" xmlns:oel="http://schemas.microsoft.com/office/2019/extlst" xmlns:r="http://schemas.openxmlformats.org/officeDocument/2006/relationships" xmlns:m="http://schemas.openxmlformats.org/officeDocument/2006/math" xmlns:v="urn:schemas-microsoft-com:vml" xmlns:wp14="http://schemas.microsoft.com/office/word/2010/wordprocessingDrawing" xmlns:wp="http://schemas.openxmlformats.org/drawingml/2006/wordprocessingDrawing" xmlns:w10="urn:schemas-microsoft-com:office:word" xmlns:w="http://schemas.openxmlformats.org/wordprocessingml/2006/main" xmlns:w14="http://schemas.microsoft.com/office/word/2010/wordml" xmlns:w15="http://schemas.microsoft.com/office/word/2012/wordml" xmlns:w16cex="http://schemas.microsoft.com/office/word/2018/wordml/cex" xmlns:w16cid="http://schemas.microsoft.com/office/word/2016/wordml/cid" xmlns:w16="http://schemas.microsoft.com/office/word/2018/wordml" xmlns:w16du="http://schemas.microsoft.com/office/word/2023/wordml/word16du" xmlns:w16sdtdh="http://schemas.microsoft.com/office/word/2020/wordml/sdtdatahash" xmlns:w16se="http://schemas.microsoft.com/office/word/2015/wordml/symex" xmlns:wpg="http://schemas.microsoft.com/office/word/2010/wordprocessingGroup" xmlns:wpi="http://schemas.microsoft.com/office/word/2010/wordprocessingInk" xmlns:wne="http://schemas.microsoft.com/office/word/2006/wordml" xmlns:wps="http://schemas.microsoft.com/office/word/2010/wordprocessingShape" mc:Ignorable="w14 w15 w16se w16cid w16 w16cex w16sdtdh w16du wp14">
+<w:ftr xmlns:wpc="http://schemas.microsoft.com/office/word/2010/wordprocessingCanvas" xmlns:cx="http://schemas.microsoft.com/office/drawing/2014/chartex" xmlns:cx1="http://schemas.microsoft.com/office/drawing/2015/9/8/chartex" xmlns:cx2="http://schemas.microsoft.com/office/drawing/2015/10/21/chartex" xmlns:cx3="http://schemas.microsoft.com/office/drawing/2016/5/9/chartex" xmlns:cx4="http://schemas.microsoft.com/office/drawing/2016/5/10/chartex" xmlns:cx5="http://schemas.microsoft.com/office/drawing/2016/5/11/chartex" xmlns:cx6="http://schemas.microsoft.com/office/drawing/2016/5/12/chartex" xmlns:cx7="http://schemas.microsoft.com/office/drawing/2016/5/13/chartex" xmlns:cx8="http://schemas.microsoft.com/office/drawing/2016/5/14/chartex" xmlns:mc="http://schemas.openxmlformats.org/markup-compatibility/2006" xmlns:aink="http://schemas.microsoft.com/office/drawing/2016/ink" xmlns:am3d="http://schemas.microsoft.com/office/drawing/2017/model3d" xmlns:o="urn:schemas-microsoft-com:office:office" xmlns:oel="http://schemas.microsoft.com/office/2019/extlst" xmlns:r="http://schemas.openxmlformats.org/officeDocument/2006/relationships" xmlns:m="http://schemas.openxmlformats.org/officeDocument/2006/math" xmlns:v="urn:schemas-microsoft-com:vml" xmlns:wp14="http://schemas.microsoft.com/office/word/2010/wordprocessingDrawing" xmlns:wp="http://schemas.openxmlformats.org/drawingml/2006/wordprocessingDrawing" xmlns:w10="urn:schemas-microsoft-com:office:word" xmlns:w="http://schemas.openxmlformats.org/wordprocessingml/2006/main" xmlns:w14="http://schemas.microsoft.com/office/word/2010/wordml" xmlns:w15="http://schemas.microsoft.com/office/word/2012/wordml" xmlns:w16cex="http://schemas.microsoft.com/office/word/2018/wordml/cex" xmlns:w16cid="http://schemas.microsoft.com/office/word/2016/wordml/cid" xmlns:w16="http://schemas.microsoft.com/office/word/2018/wordml" xmlns:w16du="http://schemas.microsoft.com/office/word/2023/wordml/word16du" xmlns:w16sdtdh="http://schemas.microsoft.com/office/word/2020/wordml/sdtdatahash" xmlns:w16sdtfl="http://schemas.microsoft.com/office/word/2024/wordml/sdtformatlock" xmlns:w16se="http://schemas.microsoft.com/office/word/2015/wordml/symex" xmlns:wpg="http://schemas.microsoft.com/office/word/2010/wordprocessingGroup" xmlns:wpi="http://schemas.microsoft.com/office/word/2010/wordprocessingInk" xmlns:wne="http://schemas.microsoft.com/office/word/2006/wordml" xmlns:wps="http://schemas.microsoft.com/office/word/2010/wordprocessingShape" mc:Ignorable="w14 w15 w16se w16cid w16 w16cex w16sdtdh w16sdtfl w16du wp14">
   <w:p>
     <w:pPr>
       <w:ind w:firstLine="0"/>
@@ -642,7 +940,7 @@
 </file>
 
 <file path=word/footnotes.xml><?xml version="1.0" encoding="utf-8"?>
-<w:footnotes xmlns:wpc="http://schemas.microsoft.com/office/word/2010/wordprocessingCanvas" xmlns:cx="http://schemas.microsoft.com/office/drawing/2014/chartex" xmlns:cx1="http://schemas.microsoft.com/office/drawing/2015/9/8/chartex" xmlns:cx2="http://schemas.microsoft.com/office/drawing/2015/10/21/chartex" xmlns:cx3="http://schemas.microsoft.com/office/drawing/2016/5/9/chartex" xmlns:cx4="http://schemas.microsoft.com/office/drawing/2016/5/10/chartex" xmlns:cx5="http://schemas.microsoft.com/office/drawing/2016/5/11/chartex" xmlns:cx6="http://schemas.microsoft.com/office/drawing/2016/5/12/chartex" xmlns:cx7="http://schemas.microsoft.com/office/drawing/2016/5/13/chartex" xmlns:cx8="http://schemas.microsoft.com/office/drawing/2016/5/14/chartex" xmlns:mc="http://schemas.openxmlformats.org/markup-compatibility/2006" xmlns:aink="http://schemas.microsoft.com/office/drawing/2016/ink" xmlns:am3d="http://schemas.microsoft.com/office/drawing/2017/model3d" xmlns:o="urn:schemas-microsoft-com:office:office" xmlns:oel="http://schemas.microsoft.com/office/2019/extlst" xmlns:r="http://schemas.openxmlformats.org/officeDocument/2006/relationships" xmlns:m="http://schemas.openxmlformats.org/officeDocument/2006/math" xmlns:v="urn:schemas-microsoft-com:vml" xmlns:wp14="http://schemas.microsoft.com/office/word/2010/wordprocessingDrawing" xmlns:wp="http://schemas.openxmlformats.org/drawingml/2006/wordprocessingDrawing" xmlns:w10="urn:schemas-microsoft-com:office:word" xmlns:w="http://schemas.openxmlformats.org/wordprocessingml/2006/main" xmlns:w14="http://schemas.microsoft.com/office/word/2010/wordml" xmlns:w15="http://schemas.microsoft.com/office/word/2012/wordml" xmlns:w16cex="http://schemas.microsoft.com/office/word/2018/wordml/cex" xmlns:w16cid="http://schemas.microsoft.com/office/word/2016/wordml/cid" xmlns:w16="http://schemas.microsoft.com/office/word/2018/wordml" xmlns:w16du="http://schemas.microsoft.com/office/word/2023/wordml/word16du" xmlns:w16sdtdh="http://schemas.microsoft.com/office/word/2020/wordml/sdtdatahash" xmlns:w16se="http://schemas.microsoft.com/office/word/2015/wordml/symex" xmlns:wpg="http://schemas.microsoft.com/office/word/2010/wordprocessingGroup" xmlns:wpi="http://schemas.microsoft.com/office/word/2010/wordprocessingInk" xmlns:wne="http://schemas.microsoft.com/office/word/2006/wordml" xmlns:wps="http://schemas.microsoft.com/office/word/2010/wordprocessingShape" mc:Ignorable="w14 w15 w16se w16cid w16 w16cex w16sdtdh w16du wp14">
+<w:footnotes xmlns:wpc="http://schemas.microsoft.com/office/word/2010/wordprocessingCanvas" xmlns:cx="http://schemas.microsoft.com/office/drawing/2014/chartex" xmlns:cx1="http://schemas.microsoft.com/office/drawing/2015/9/8/chartex" xmlns:cx2="http://schemas.microsoft.com/office/drawing/2015/10/21/chartex" xmlns:cx3="http://schemas.microsoft.com/office/drawing/2016/5/9/chartex" xmlns:cx4="http://schemas.microsoft.com/office/drawing/2016/5/10/chartex" xmlns:cx5="http://schemas.microsoft.com/office/drawing/2016/5/11/chartex" xmlns:cx6="http://schemas.microsoft.com/office/drawing/2016/5/12/chartex" xmlns:cx7="http://schemas.microsoft.com/office/drawing/2016/5/13/chartex" xmlns:cx8="http://schemas.microsoft.com/office/drawing/2016/5/14/chartex" xmlns:mc="http://schemas.openxmlformats.org/markup-compatibility/2006" xmlns:aink="http://schemas.microsoft.com/office/drawing/2016/ink" xmlns:am3d="http://schemas.microsoft.com/office/drawing/2017/model3d" xmlns:o="urn:schemas-microsoft-com:office:office" xmlns:oel="http://schemas.microsoft.com/office/2019/extlst" xmlns:r="http://schemas.openxmlformats.org/officeDocument/2006/relationships" xmlns:m="http://schemas.openxmlformats.org/officeDocument/2006/math" xmlns:v="urn:schemas-microsoft-com:vml" xmlns:wp14="http://schemas.microsoft.com/office/word/2010/wordprocessingDrawing" xmlns:wp="http://schemas.openxmlformats.org/drawingml/2006/wordprocessingDrawing" xmlns:w10="urn:schemas-microsoft-com:office:word" xmlns:w="http://schemas.openxmlformats.org/wordprocessingml/2006/main" xmlns:w14="http://schemas.microsoft.com/office/word/2010/wordml" xmlns:w15="http://schemas.microsoft.com/office/word/2012/wordml" xmlns:w16cex="http://schemas.microsoft.com/office/word/2018/wordml/cex" xmlns:w16cid="http://schemas.microsoft.com/office/word/2016/wordml/cid" xmlns:w16="http://schemas.microsoft.com/office/word/2018/wordml" xmlns:w16du="http://schemas.microsoft.com/office/word/2023/wordml/word16du" xmlns:w16sdtdh="http://schemas.microsoft.com/office/word/2020/wordml/sdtdatahash" xmlns:w16sdtfl="http://schemas.microsoft.com/office/word/2024/wordml/sdtformatlock" xmlns:w16se="http://schemas.microsoft.com/office/word/2015/wordml/symex" xmlns:wpg="http://schemas.microsoft.com/office/word/2010/wordprocessingGroup" xmlns:wpi="http://schemas.microsoft.com/office/word/2010/wordprocessingInk" xmlns:wne="http://schemas.microsoft.com/office/word/2006/wordml" xmlns:wps="http://schemas.microsoft.com/office/word/2010/wordprocessingShape" mc:Ignorable="w14 w15 w16se w16cid w16 w16cex w16sdtdh w16sdtfl w16du wp14">
   <w:footnote w:type="separator" w:id="-1">
     <w:p>
       <w:r>
@@ -661,7 +959,7 @@
 </file>
 
 <file path=word/header1.xml><?xml version="1.0" encoding="utf-8"?>
-<w:hdr xmlns:wpc="http://schemas.microsoft.com/office/word/2010/wordprocessingCanvas" xmlns:cx="http://schemas.microsoft.com/office/drawing/2014/chartex" xmlns:cx1="http://schemas.microsoft.com/office/drawing/2015/9/8/chartex" xmlns:cx2="http://schemas.microsoft.com/office/drawing/2015/10/21/chartex" xmlns:cx3="http://schemas.microsoft.com/office/drawing/2016/5/9/chartex" xmlns:cx4="http://schemas.microsoft.com/office/drawing/2016/5/10/chartex" xmlns:cx5="http://schemas.microsoft.com/office/drawing/2016/5/11/chartex" xmlns:cx6="http://schemas.microsoft.com/office/drawing/2016/5/12/chartex" xmlns:cx7="http://schemas.microsoft.com/office/drawing/2016/5/13/chartex" xmlns:cx8="http://schemas.microsoft.com/office/drawing/2016/5/14/chartex" xmlns:mc="http://schemas.openxmlformats.org/markup-compatibility/2006" xmlns:aink="http://schemas.microsoft.com/office/drawing/2016/ink" xmlns:am3d="http://schemas.microsoft.com/office/drawing/2017/model3d" xmlns:o="urn:schemas-microsoft-com:office:office" xmlns:oel="http://schemas.microsoft.com/office/2019/extlst" xmlns:r="http://schemas.openxmlformats.org/officeDocument/2006/relationships" xmlns:m="http://schemas.openxmlformats.org/officeDocument/2006/math" xmlns:v="urn:schemas-microsoft-com:vml" xmlns:wp14="http://schemas.microsoft.com/office/word/2010/wordprocessingDrawing" xmlns:wp="http://schemas.openxmlformats.org/drawingml/2006/wordprocessingDrawing" xmlns:w10="urn:schemas-microsoft-com:office:word" xmlns:w="http://schemas.openxmlformats.org/wordprocessingml/2006/main" xmlns:w14="http://schemas.microsoft.com/office/word/2010/wordml" xmlns:w15="http://schemas.microsoft.com/office/word/2012/wordml" xmlns:w16cex="http://schemas.microsoft.com/office/word/2018/wordml/cex" xmlns:w16cid="http://schemas.microsoft.com/office/word/2016/wordml/cid" xmlns:w16="http://schemas.microsoft.com/office/word/2018/wordml" xmlns:w16du="http://schemas.microsoft.com/office/word/2023/wordml/word16du" xmlns:w16sdtdh="http://schemas.microsoft.com/office/word/2020/wordml/sdtdatahash" xmlns:w16se="http://schemas.microsoft.com/office/word/2015/wordml/symex" xmlns:wpg="http://schemas.microsoft.com/office/word/2010/wordprocessingGroup" xmlns:wpi="http://schemas.microsoft.com/office/word/2010/wordprocessingInk" xmlns:wne="http://schemas.microsoft.com/office/word/2006/wordml" xmlns:wps="http://schemas.microsoft.com/office/word/2010/wordprocessingShape" mc:Ignorable="w14 w15 w16se w16cid w16 w16cex w16sdtdh w16du wp14">
+<w:hdr xmlns:wpc="http://schemas.microsoft.com/office/word/2010/wordprocessingCanvas" xmlns:cx="http://schemas.microsoft.com/office/drawing/2014/chartex" xmlns:cx1="http://schemas.microsoft.com/office/drawing/2015/9/8/chartex" xmlns:cx2="http://schemas.microsoft.com/office/drawing/2015/10/21/chartex" xmlns:cx3="http://schemas.microsoft.com/office/drawing/2016/5/9/chartex" xmlns:cx4="http://schemas.microsoft.com/office/drawing/2016/5/10/chartex" xmlns:cx5="http://schemas.microsoft.com/office/drawing/2016/5/11/chartex" xmlns:cx6="http://schemas.microsoft.com/office/drawing/2016/5/12/chartex" xmlns:cx7="http://schemas.microsoft.com/office/drawing/2016/5/13/chartex" xmlns:cx8="http://schemas.microsoft.com/office/drawing/2016/5/14/chartex" xmlns:mc="http://schemas.openxmlformats.org/markup-compatibility/2006" xmlns:aink="http://schemas.microsoft.com/office/drawing/2016/ink" xmlns:am3d="http://schemas.microsoft.com/office/drawing/2017/model3d" xmlns:o="urn:schemas-microsoft-com:office:office" xmlns:oel="http://schemas.microsoft.com/office/2019/extlst" xmlns:r="http://schemas.openxmlformats.org/officeDocument/2006/relationships" xmlns:m="http://schemas.openxmlformats.org/officeDocument/2006/math" xmlns:v="urn:schemas-microsoft-com:vml" xmlns:wp14="http://schemas.microsoft.com/office/word/2010/wordprocessingDrawing" xmlns:wp="http://schemas.openxmlformats.org/drawingml/2006/wordprocessingDrawing" xmlns:w10="urn:schemas-microsoft-com:office:word" xmlns:w="http://schemas.openxmlformats.org/wordprocessingml/2006/main" xmlns:w14="http://schemas.microsoft.com/office/word/2010/wordml" xmlns:w15="http://schemas.microsoft.com/office/word/2012/wordml" xmlns:w16cex="http://schemas.microsoft.com/office/word/2018/wordml/cex" xmlns:w16cid="http://schemas.microsoft.com/office/word/2016/wordml/cid" xmlns:w16="http://schemas.microsoft.com/office/word/2018/wordml" xmlns:w16du="http://schemas.microsoft.com/office/word/2023/wordml/word16du" xmlns:w16sdtdh="http://schemas.microsoft.com/office/word/2020/wordml/sdtdatahash" xmlns:w16sdtfl="http://schemas.microsoft.com/office/word/2024/wordml/sdtformatlock" xmlns:w16se="http://schemas.microsoft.com/office/word/2015/wordml/symex" xmlns:wpg="http://schemas.microsoft.com/office/word/2010/wordprocessingGroup" xmlns:wpi="http://schemas.microsoft.com/office/word/2010/wordprocessingInk" xmlns:wne="http://schemas.microsoft.com/office/word/2006/wordml" xmlns:wps="http://schemas.microsoft.com/office/word/2010/wordprocessingShape" mc:Ignorable="w14 w15 w16se w16cid w16 w16cex w16sdtdh w16sdtfl w16du wp14">
   <w:p>
     <w:pPr>
       <w:pStyle w:val="Header"/>
@@ -672,7 +970,7 @@
 </file>
 
 <file path=word/header2.xml><?xml version="1.0" encoding="utf-8"?>
-<w:hdr xmlns:wpc="http://schemas.microsoft.com/office/word/2010/wordprocessingCanvas" xmlns:cx="http://schemas.microsoft.com/office/drawing/2014/chartex" xmlns:cx1="http://schemas.microsoft.com/office/drawing/2015/9/8/chartex" xmlns:cx2="http://schemas.microsoft.com/office/drawing/2015/10/21/chartex" xmlns:cx3="http://schemas.microsoft.com/office/drawing/2016/5/9/chartex" xmlns:cx4="http://schemas.microsoft.com/office/drawing/2016/5/10/chartex" xmlns:cx5="http://schemas.microsoft.com/office/drawing/2016/5/11/chartex" xmlns:cx6="http://schemas.microsoft.com/office/drawing/2016/5/12/chartex" xmlns:cx7="http://schemas.microsoft.com/office/drawing/2016/5/13/chartex" xmlns:cx8="http://schemas.microsoft.com/office/drawing/2016/5/14/chartex" xmlns:mc="http://schemas.openxmlformats.org/markup-compatibility/2006" xmlns:aink="http://schemas.microsoft.com/office/drawing/2016/ink" xmlns:am3d="http://schemas.microsoft.com/office/drawing/2017/model3d" xmlns:o="urn:schemas-microsoft-com:office:office" xmlns:oel="http://schemas.microsoft.com/office/2019/extlst" xmlns:r="http://schemas.openxmlformats.org/officeDocument/2006/relationships" xmlns:m="http://schemas.openxmlformats.org/officeDocument/2006/math" xmlns:v="urn:schemas-microsoft-com:vml" xmlns:wp14="http://schemas.microsoft.com/office/word/2010/wordprocessingDrawing" xmlns:wp="http://schemas.openxmlformats.org/drawingml/2006/wordprocessingDrawing" xmlns:w10="urn:schemas-microsoft-com:office:word" xmlns:w="http://schemas.openxmlformats.org/wordprocessingml/2006/main" xmlns:w14="http://schemas.microsoft.com/office/word/2010/wordml" xmlns:w15="http://schemas.microsoft.com/office/word/2012/wordml" xmlns:w16cex="http://schemas.microsoft.com/office/word/2018/wordml/cex" xmlns:w16cid="http://schemas.microsoft.com/office/word/2016/wordml/cid" xmlns:w16="http://schemas.microsoft.com/office/word/2018/wordml" xmlns:w16du="http://schemas.microsoft.com/office/word/2023/wordml/word16du" xmlns:w16sdtdh="http://schemas.microsoft.com/office/word/2020/wordml/sdtdatahash" xmlns:w16se="http://schemas.microsoft.com/office/word/2015/wordml/symex" xmlns:wpg="http://schemas.microsoft.com/office/word/2010/wordprocessingGroup" xmlns:wpi="http://schemas.microsoft.com/office/word/2010/wordprocessingInk" xmlns:wne="http://schemas.microsoft.com/office/word/2006/wordml" xmlns:wps="http://schemas.microsoft.com/office/word/2010/wordprocessingShape" mc:Ignorable="w14 w15 w16se w16cid w16 w16cex w16sdtdh w16du wp14">
+<w:hdr xmlns:wpc="http://schemas.microsoft.com/office/word/2010/wordprocessingCanvas" xmlns:cx="http://schemas.microsoft.com/office/drawing/2014/chartex" xmlns:cx1="http://schemas.microsoft.com/office/drawing/2015/9/8/chartex" xmlns:cx2="http://schemas.microsoft.com/office/drawing/2015/10/21/chartex" xmlns:cx3="http://schemas.microsoft.com/office/drawing/2016/5/9/chartex" xmlns:cx4="http://schemas.microsoft.com/office/drawing/2016/5/10/chartex" xmlns:cx5="http://schemas.microsoft.com/office/drawing/2016/5/11/chartex" xmlns:cx6="http://schemas.microsoft.com/office/drawing/2016/5/12/chartex" xmlns:cx7="http://schemas.microsoft.com/office/drawing/2016/5/13/chartex" xmlns:cx8="http://schemas.microsoft.com/office/drawing/2016/5/14/chartex" xmlns:mc="http://schemas.openxmlformats.org/markup-compatibility/2006" xmlns:aink="http://schemas.microsoft.com/office/drawing/2016/ink" xmlns:am3d="http://schemas.microsoft.com/office/drawing/2017/model3d" xmlns:o="urn:schemas-microsoft-com:office:office" xmlns:oel="http://schemas.microsoft.com/office/2019/extlst" xmlns:r="http://schemas.openxmlformats.org/officeDocument/2006/relationships" xmlns:m="http://schemas.openxmlformats.org/officeDocument/2006/math" xmlns:v="urn:schemas-microsoft-com:vml" xmlns:wp14="http://schemas.microsoft.com/office/word/2010/wordprocessingDrawing" xmlns:wp="http://schemas.openxmlformats.org/drawingml/2006/wordprocessingDrawing" xmlns:w10="urn:schemas-microsoft-com:office:word" xmlns:w="http://schemas.openxmlformats.org/wordprocessingml/2006/main" xmlns:w14="http://schemas.microsoft.com/office/word/2010/wordml" xmlns:w15="http://schemas.microsoft.com/office/word/2012/wordml" xmlns:w16cex="http://schemas.microsoft.com/office/word/2018/wordml/cex" xmlns:w16cid="http://schemas.microsoft.com/office/word/2016/wordml/cid" xmlns:w16="http://schemas.microsoft.com/office/word/2018/wordml" xmlns:w16du="http://schemas.microsoft.com/office/word/2023/wordml/word16du" xmlns:w16sdtdh="http://schemas.microsoft.com/office/word/2020/wordml/sdtdatahash" xmlns:w16sdtfl="http://schemas.microsoft.com/office/word/2024/wordml/sdtformatlock" xmlns:w16se="http://schemas.microsoft.com/office/word/2015/wordml/symex" xmlns:wpg="http://schemas.microsoft.com/office/word/2010/wordprocessingGroup" xmlns:wpi="http://schemas.microsoft.com/office/word/2010/wordprocessingInk" xmlns:wne="http://schemas.microsoft.com/office/word/2006/wordml" xmlns:wps="http://schemas.microsoft.com/office/word/2010/wordprocessingShape" mc:Ignorable="w14 w15 w16se w16cid w16 w16cex w16sdtdh w16sdtfl w16du wp14">
   <w:p>
     <w:pPr>
       <w:rPr>
@@ -891,7 +1189,7 @@
 </file>
 
 <file path=word/numbering.xml><?xml version="1.0" encoding="utf-8"?>
-<w:numbering xmlns:wpc="http://schemas.microsoft.com/office/word/2010/wordprocessingCanvas" xmlns:cx="http://schemas.microsoft.com/office/drawing/2014/chartex" xmlns:cx1="http://schemas.microsoft.com/office/drawing/2015/9/8/chartex" xmlns:cx2="http://schemas.microsoft.com/office/drawing/2015/10/21/chartex" xmlns:cx3="http://schemas.microsoft.com/office/drawing/2016/5/9/chartex" xmlns:cx4="http://schemas.microsoft.com/office/drawing/2016/5/10/chartex" xmlns:cx5="http://schemas.microsoft.com/office/drawing/2016/5/11/chartex" xmlns:cx6="http://schemas.microsoft.com/office/drawing/2016/5/12/chartex" xmlns:cx7="http://schemas.microsoft.com/office/drawing/2016/5/13/chartex" xmlns:cx8="http://schemas.microsoft.com/office/drawing/2016/5/14/chartex" xmlns:mc="http://schemas.openxmlformats.org/markup-compatibility/2006" xmlns:aink="http://schemas.microsoft.com/office/drawing/2016/ink" xmlns:am3d="http://schemas.microsoft.com/office/drawing/2017/model3d" xmlns:o="urn:schemas-microsoft-com:office:office" xmlns:oel="http://schemas.microsoft.com/office/2019/extlst" xmlns:r="http://schemas.openxmlformats.org/officeDocument/2006/relationships" xmlns:m="http://schemas.openxmlformats.org/officeDocument/2006/math" xmlns:v="urn:schemas-microsoft-com:vml" xmlns:wp14="http://schemas.microsoft.com/office/word/2010/wordprocessingDrawing" xmlns:wp="http://schemas.openxmlformats.org/drawingml/2006/wordprocessingDrawing" xmlns:w10="urn:schemas-microsoft-com:office:word" xmlns:w="http://schemas.openxmlformats.org/wordprocessingml/2006/main" xmlns:w14="http://schemas.microsoft.com/office/word/2010/wordml" xmlns:w15="http://schemas.microsoft.com/office/word/2012/wordml" xmlns:w16cex="http://schemas.microsoft.com/office/word/2018/wordml/cex" xmlns:w16cid="http://schemas.microsoft.com/office/word/2016/wordml/cid" xmlns:w16="http://schemas.microsoft.com/office/word/2018/wordml" xmlns:w16du="http://schemas.microsoft.com/office/word/2023/wordml/word16du" xmlns:w16sdtdh="http://schemas.microsoft.com/office/word/2020/wordml/sdtdatahash" xmlns:w16se="http://schemas.microsoft.com/office/word/2015/wordml/symex" xmlns:wpg="http://schemas.microsoft.com/office/word/2010/wordprocessingGroup" xmlns:wpi="http://schemas.microsoft.com/office/word/2010/wordprocessingInk" xmlns:wne="http://schemas.microsoft.com/office/word/2006/wordml" xmlns:wps="http://schemas.microsoft.com/office/word/2010/wordprocessingShape" mc:Ignorable="w14 w15 w16se w16cid w16 w16cex w16sdtdh w16du wp14">
+<w:numbering xmlns:wpc="http://schemas.microsoft.com/office/word/2010/wordprocessingCanvas" xmlns:cx="http://schemas.microsoft.com/office/drawing/2014/chartex" xmlns:cx1="http://schemas.microsoft.com/office/drawing/2015/9/8/chartex" xmlns:cx2="http://schemas.microsoft.com/office/drawing/2015/10/21/chartex" xmlns:cx3="http://schemas.microsoft.com/office/drawing/2016/5/9/chartex" xmlns:cx4="http://schemas.microsoft.com/office/drawing/2016/5/10/chartex" xmlns:cx5="http://schemas.microsoft.com/office/drawing/2016/5/11/chartex" xmlns:cx6="http://schemas.microsoft.com/office/drawing/2016/5/12/chartex" xmlns:cx7="http://schemas.microsoft.com/office/drawing/2016/5/13/chartex" xmlns:cx8="http://schemas.microsoft.com/office/drawing/2016/5/14/chartex" xmlns:mc="http://schemas.openxmlformats.org/markup-compatibility/2006" xmlns:aink="http://schemas.microsoft.com/office/drawing/2016/ink" xmlns:am3d="http://schemas.microsoft.com/office/drawing/2017/model3d" xmlns:o="urn:schemas-microsoft-com:office:office" xmlns:oel="http://schemas.microsoft.com/office/2019/extlst" xmlns:r="http://schemas.openxmlformats.org/officeDocument/2006/relationships" xmlns:m="http://schemas.openxmlformats.org/officeDocument/2006/math" xmlns:v="urn:schemas-microsoft-com:vml" xmlns:wp14="http://schemas.microsoft.com/office/word/2010/wordprocessingDrawing" xmlns:wp="http://schemas.openxmlformats.org/drawingml/2006/wordprocessingDrawing" xmlns:w10="urn:schemas-microsoft-com:office:word" xmlns:w="http://schemas.openxmlformats.org/wordprocessingml/2006/main" xmlns:w14="http://schemas.microsoft.com/office/word/2010/wordml" xmlns:w15="http://schemas.microsoft.com/office/word/2012/wordml" xmlns:w16cex="http://schemas.microsoft.com/office/word/2018/wordml/cex" xmlns:w16cid="http://schemas.microsoft.com/office/word/2016/wordml/cid" xmlns:w16="http://schemas.microsoft.com/office/word/2018/wordml" xmlns:w16du="http://schemas.microsoft.com/office/word/2023/wordml/word16du" xmlns:w16sdtdh="http://schemas.microsoft.com/office/word/2020/wordml/sdtdatahash" xmlns:w16sdtfl="http://schemas.microsoft.com/office/word/2024/wordml/sdtformatlock" xmlns:w16se="http://schemas.microsoft.com/office/word/2015/wordml/symex" xmlns:wpg="http://schemas.microsoft.com/office/word/2010/wordprocessingGroup" xmlns:wpi="http://schemas.microsoft.com/office/word/2010/wordprocessingInk" xmlns:wne="http://schemas.microsoft.com/office/word/2006/wordml" xmlns:wps="http://schemas.microsoft.com/office/word/2010/wordprocessingShape" mc:Ignorable="w14 w15 w16se w16cid w16 w16cex w16sdtdh w16sdtfl w16du wp14">
   <w:abstractNum w:abstractNumId="0" w15:restartNumberingAfterBreak="0">
     <w:nsid w:val="FFFFFF1D"/>
     <w:multiLevelType w:val="multilevel"/>
@@ -3751,8 +4049,16 @@
 </w:numbering>
 </file>
 
+<file path=word/people.xml><?xml version="1.0" encoding="utf-8"?>
+<w15:people xmlns:wpc="http://schemas.microsoft.com/office/word/2010/wordprocessingCanvas" xmlns:cx="http://schemas.microsoft.com/office/drawing/2014/chartex" xmlns:cx1="http://schemas.microsoft.com/office/drawing/2015/9/8/chartex" xmlns:cx2="http://schemas.microsoft.com/office/drawing/2015/10/21/chartex" xmlns:cx3="http://schemas.microsoft.com/office/drawing/2016/5/9/chartex" xmlns:cx4="http://schemas.microsoft.com/office/drawing/2016/5/10/chartex" xmlns:cx5="http://schemas.microsoft.com/office/drawing/2016/5/11/chartex" xmlns:cx6="http://schemas.microsoft.com/office/drawing/2016/5/12/chartex" xmlns:cx7="http://schemas.microsoft.com/office/drawing/2016/5/13/chartex" xmlns:cx8="http://schemas.microsoft.com/office/drawing/2016/5/14/chartex" xmlns:mc="http://schemas.openxmlformats.org/markup-compatibility/2006" xmlns:aink="http://schemas.microsoft.com/office/drawing/2016/ink" xmlns:am3d="http://schemas.microsoft.com/office/drawing/2017/model3d" xmlns:o="urn:schemas-microsoft-com:office:office" xmlns:oel="http://schemas.microsoft.com/office/2019/extlst" xmlns:r="http://schemas.openxmlformats.org/officeDocument/2006/relationships" xmlns:m="http://schemas.openxmlformats.org/officeDocument/2006/math" xmlns:v="urn:schemas-microsoft-com:vml" xmlns:wp14="http://schemas.microsoft.com/office/word/2010/wordprocessingDrawing" xmlns:wp="http://schemas.openxmlformats.org/drawingml/2006/wordprocessingDrawing" xmlns:w10="urn:schemas-microsoft-com:office:word" xmlns:w="http://schemas.openxmlformats.org/wordprocessingml/2006/main" xmlns:w14="http://schemas.microsoft.com/office/word/2010/wordml" xmlns:w15="http://schemas.microsoft.com/office/word/2012/wordml" xmlns:w16cex="http://schemas.microsoft.com/office/word/2018/wordml/cex" xmlns:w16cid="http://schemas.microsoft.com/office/word/2016/wordml/cid" xmlns:w16="http://schemas.microsoft.com/office/word/2018/wordml" xmlns:w16du="http://schemas.microsoft.com/office/word/2023/wordml/word16du" xmlns:w16sdtdh="http://schemas.microsoft.com/office/word/2020/wordml/sdtdatahash" xmlns:w16sdtfl="http://schemas.microsoft.com/office/word/2024/wordml/sdtformatlock" xmlns:w16se="http://schemas.microsoft.com/office/word/2015/wordml/symex" xmlns:wpg="http://schemas.microsoft.com/office/word/2010/wordprocessingGroup" xmlns:wpi="http://schemas.microsoft.com/office/word/2010/wordprocessingInk" xmlns:wne="http://schemas.microsoft.com/office/word/2006/wordml" xmlns:wps="http://schemas.microsoft.com/office/word/2010/wordprocessingShape" mc:Ignorable="w14 w15 w16se w16cid w16 w16cex w16sdtdh w16sdtfl w16du wp14">
+  <w15:person w15:author="Jaeger, Florian">
+    <w15:presenceInfo w15:providerId="AD" w15:userId="S::fjaeger@ur.rochester.edu::0d0acd91-09a2-4ddb-a934-22efc544688e"/>
+  </w15:person>
+</w15:people>
+</file>
+
 <file path=word/styles.xml><?xml version="1.0" encoding="utf-8"?>
-<w:styles xmlns:mc="http://schemas.openxmlformats.org/markup-compatibility/2006" xmlns:r="http://schemas.openxmlformats.org/officeDocument/2006/relationships" xmlns:w="http://schemas.openxmlformats.org/wordprocessingml/2006/main" xmlns:w14="http://schemas.microsoft.com/office/word/2010/wordml" xmlns:w15="http://schemas.microsoft.com/office/word/2012/wordml" xmlns:w16cex="http://schemas.microsoft.com/office/word/2018/wordml/cex" xmlns:w16cid="http://schemas.microsoft.com/office/word/2016/wordml/cid" xmlns:w16="http://schemas.microsoft.com/office/word/2018/wordml" xmlns:w16du="http://schemas.microsoft.com/office/word/2023/wordml/word16du" xmlns:w16sdtdh="http://schemas.microsoft.com/office/word/2020/wordml/sdtdatahash" xmlns:w16se="http://schemas.microsoft.com/office/word/2015/wordml/symex" mc:Ignorable="w14 w15 w16se w16cid w16 w16cex w16sdtdh w16du">
+<w:styles xmlns:mc="http://schemas.openxmlformats.org/markup-compatibility/2006" xmlns:r="http://schemas.openxmlformats.org/officeDocument/2006/relationships" xmlns:w="http://schemas.openxmlformats.org/wordprocessingml/2006/main" xmlns:w14="http://schemas.microsoft.com/office/word/2010/wordml" xmlns:w15="http://schemas.microsoft.com/office/word/2012/wordml" xmlns:w16cex="http://schemas.microsoft.com/office/word/2018/wordml/cex" xmlns:w16cid="http://schemas.microsoft.com/office/word/2016/wordml/cid" xmlns:w16="http://schemas.microsoft.com/office/word/2018/wordml" xmlns:w16du="http://schemas.microsoft.com/office/word/2023/wordml/word16du" xmlns:w16sdtdh="http://schemas.microsoft.com/office/word/2020/wordml/sdtdatahash" xmlns:w16sdtfl="http://schemas.microsoft.com/office/word/2024/wordml/sdtformatlock" xmlns:w16se="http://schemas.microsoft.com/office/word/2015/wordml/symex" mc:Ignorable="w14 w15 w16se w16cid w16 w16cex w16sdtdh w16sdtfl w16du">
   <w:docDefaults>
     <w:rPrDefault>
       <w:rPr>
@@ -4125,6 +4431,7 @@
   <w:style w:type="character" w:default="1" w:styleId="DefaultParagraphFont">
     <w:name w:val="Default Paragraph Font"/>
     <w:uiPriority w:val="1"/>
+    <w:semiHidden/>
     <w:unhideWhenUsed/>
   </w:style>
   <w:style w:type="table" w:default="1" w:styleId="TableNormal">

</xml_diff>

<commit_message>
accept changes, review, and create .pdfs
</commit_message>
<xml_diff>
--- a/output/papers/Round 3/letter to the editors.docx
+++ b/output/papers/Round 3/letter to the editors.docx
@@ -1,6 +1,6 @@
 
 <file path=word/document.xml><?xml version="1.0" encoding="utf-8"?>
-<w:document xmlns:wpc="http://schemas.microsoft.com/office/word/2010/wordprocessingCanvas" xmlns:cx="http://schemas.microsoft.com/office/drawing/2014/chartex" xmlns:cx1="http://schemas.microsoft.com/office/drawing/2015/9/8/chartex" xmlns:cx2="http://schemas.microsoft.com/office/drawing/2015/10/21/chartex" xmlns:cx3="http://schemas.microsoft.com/office/drawing/2016/5/9/chartex" xmlns:cx4="http://schemas.microsoft.com/office/drawing/2016/5/10/chartex" xmlns:cx5="http://schemas.microsoft.com/office/drawing/2016/5/11/chartex" xmlns:cx6="http://schemas.microsoft.com/office/drawing/2016/5/12/chartex" xmlns:cx7="http://schemas.microsoft.com/office/drawing/2016/5/13/chartex" xmlns:cx8="http://schemas.microsoft.com/office/drawing/2016/5/14/chartex" xmlns:mc="http://schemas.openxmlformats.org/markup-compatibility/2006" xmlns:aink="http://schemas.microsoft.com/office/drawing/2016/ink" xmlns:am3d="http://schemas.microsoft.com/office/drawing/2017/model3d" xmlns:o="urn:schemas-microsoft-com:office:office" xmlns:oel="http://schemas.microsoft.com/office/2019/extlst" xmlns:r="http://schemas.openxmlformats.org/officeDocument/2006/relationships" xmlns:m="http://schemas.openxmlformats.org/officeDocument/2006/math" xmlns:v="urn:schemas-microsoft-com:vml" xmlns:wp14="http://schemas.microsoft.com/office/word/2010/wordprocessingDrawing" xmlns:wp="http://schemas.openxmlformats.org/drawingml/2006/wordprocessingDrawing" xmlns:w10="urn:schemas-microsoft-com:office:word" xmlns:w="http://schemas.openxmlformats.org/wordprocessingml/2006/main" xmlns:w14="http://schemas.microsoft.com/office/word/2010/wordml" xmlns:w15="http://schemas.microsoft.com/office/word/2012/wordml" xmlns:w16cex="http://schemas.microsoft.com/office/word/2018/wordml/cex" xmlns:w16cid="http://schemas.microsoft.com/office/word/2016/wordml/cid" xmlns:w16="http://schemas.microsoft.com/office/word/2018/wordml" xmlns:w16du="http://schemas.microsoft.com/office/word/2023/wordml/word16du" xmlns:w16sdtdh="http://schemas.microsoft.com/office/word/2020/wordml/sdtdatahash" xmlns:w16sdtfl="http://schemas.microsoft.com/office/word/2024/wordml/sdtformatlock" xmlns:w16se="http://schemas.microsoft.com/office/word/2015/wordml/symex" xmlns:wpg="http://schemas.microsoft.com/office/word/2010/wordprocessingGroup" xmlns:wpi="http://schemas.microsoft.com/office/word/2010/wordprocessingInk" xmlns:wne="http://schemas.microsoft.com/office/word/2006/wordml" xmlns:wps="http://schemas.microsoft.com/office/word/2010/wordprocessingShape" mc:Ignorable="w14 w15 w16se w16cid w16 w16cex w16sdtdh w16sdtfl w16du wp14">
+<w:document xmlns:wpc="http://schemas.microsoft.com/office/word/2010/wordprocessingCanvas" xmlns:cx="http://schemas.microsoft.com/office/drawing/2014/chartex" xmlns:cx1="http://schemas.microsoft.com/office/drawing/2015/9/8/chartex" xmlns:cx2="http://schemas.microsoft.com/office/drawing/2015/10/21/chartex" xmlns:cx3="http://schemas.microsoft.com/office/drawing/2016/5/9/chartex" xmlns:cx4="http://schemas.microsoft.com/office/drawing/2016/5/10/chartex" xmlns:cx5="http://schemas.microsoft.com/office/drawing/2016/5/11/chartex" xmlns:cx6="http://schemas.microsoft.com/office/drawing/2016/5/12/chartex" xmlns:cx7="http://schemas.microsoft.com/office/drawing/2016/5/13/chartex" xmlns:cx8="http://schemas.microsoft.com/office/drawing/2016/5/14/chartex" xmlns:mc="http://schemas.openxmlformats.org/markup-compatibility/2006" xmlns:aink="http://schemas.microsoft.com/office/drawing/2016/ink" xmlns:am3d="http://schemas.microsoft.com/office/drawing/2017/model3d" xmlns:o="urn:schemas-microsoft-com:office:office" xmlns:oel="http://schemas.microsoft.com/office/2019/extlst" xmlns:r="http://schemas.openxmlformats.org/officeDocument/2006/relationships" xmlns:m="http://schemas.openxmlformats.org/officeDocument/2006/math" xmlns:v="urn:schemas-microsoft-com:vml" xmlns:wp14="http://schemas.microsoft.com/office/word/2010/wordprocessingDrawing" xmlns:wp="http://schemas.openxmlformats.org/drawingml/2006/wordprocessingDrawing" xmlns:w10="urn:schemas-microsoft-com:office:word" xmlns:w="http://schemas.openxmlformats.org/wordprocessingml/2006/main" xmlns:w14="http://schemas.microsoft.com/office/word/2010/wordml" xmlns:w15="http://schemas.microsoft.com/office/word/2012/wordml" xmlns:w16cex="http://schemas.microsoft.com/office/word/2018/wordml/cex" xmlns:w16cid="http://schemas.microsoft.com/office/word/2016/wordml/cid" xmlns:w16="http://schemas.microsoft.com/office/word/2018/wordml" xmlns:w16du="http://schemas.microsoft.com/office/word/2023/wordml/word16du" xmlns:w16sdtdh="http://schemas.microsoft.com/office/word/2020/wordml/sdtdatahash" xmlns:w16se="http://schemas.microsoft.com/office/word/2015/wordml/symex" xmlns:wpg="http://schemas.microsoft.com/office/word/2010/wordprocessingGroup" xmlns:wpi="http://schemas.microsoft.com/office/word/2010/wordprocessingInk" xmlns:wne="http://schemas.microsoft.com/office/word/2006/wordml" xmlns:wps="http://schemas.microsoft.com/office/word/2010/wordprocessingShape" mc:Ignorable="w14 w15 w16se w16cid w16 w16cex w16sdtdh w16du wp14">
   <w:body>
     <w:p>
       <w:pPr>
@@ -36,7 +36,6 @@
         </w:rPr>
         <w:t xml:space="preserve">Editorial Board of </w:t>
       </w:r>
-      <w:proofErr w:type="gramStart"/>
       <w:r>
         <w:rPr>
           <w:rFonts w:ascii="Times New Roman" w:hAnsi="Times New Roman"/>
@@ -46,7 +45,6 @@
         </w:rPr>
         <w:t>JEP:LMC</w:t>
       </w:r>
-      <w:proofErr w:type="gramEnd"/>
     </w:p>
     <w:p>
       <w:pPr>
@@ -70,7 +68,6 @@
       <w:pPr>
         <w:ind w:firstLine="0"/>
         <w:rPr>
-          <w:ins w:id="0" w:author="Jaeger, Florian" w:date="2025-08-14T11:38:00Z" w16du:dateUtc="2025-08-14T09:38:00Z"/>
           <w:rFonts w:ascii="Times New Roman" w:hAnsi="Times New Roman"/>
           <w:sz w:val="22"/>
           <w:szCs w:val="22"/>
@@ -84,267 +81,14 @@
         </w:rPr>
         <w:t xml:space="preserve">We are resubmitting our manuscript (XLM-2025-0564), entitled “Compensation in audiovisual speech perception: discounting the pen in the mouth.” </w:t>
       </w:r>
-      <w:ins w:id="1" w:author="Jaeger, Florian" w:date="2025-08-14T11:36:00Z" w16du:dateUtc="2025-08-14T09:36:00Z">
-        <w:r>
-          <w:rPr>
-            <w:rFonts w:ascii="Times New Roman" w:hAnsi="Times New Roman"/>
-            <w:sz w:val="22"/>
-            <w:szCs w:val="22"/>
-          </w:rPr>
-          <w:t xml:space="preserve">We have removed the two typos identified by R2. </w:t>
-        </w:r>
-      </w:ins>
-    </w:p>
-    <w:p>
-      <w:pPr>
-        <w:ind w:firstLine="0"/>
+      <w:r>
         <w:rPr>
-          <w:ins w:id="2" w:author="Jaeger, Florian" w:date="2025-08-14T11:38:00Z" w16du:dateUtc="2025-08-14T09:38:00Z"/>
           <w:rFonts w:ascii="Times New Roman" w:hAnsi="Times New Roman"/>
           <w:sz w:val="22"/>
           <w:szCs w:val="22"/>
         </w:rPr>
-      </w:pPr>
-    </w:p>
-    <w:p>
-      <w:pPr>
-        <w:ind w:firstLine="0"/>
-        <w:rPr>
-          <w:del w:id="3" w:author="Jaeger, Florian" w:date="2025-08-14T11:39:00Z" w16du:dateUtc="2025-08-14T09:39:00Z"/>
-          <w:rFonts w:ascii="Times New Roman" w:hAnsi="Times New Roman"/>
-          <w:sz w:val="22"/>
-          <w:szCs w:val="22"/>
-        </w:rPr>
-        <w:pPrChange w:id="4" w:author="Jaeger, Florian" w:date="2025-08-14T11:39:00Z" w16du:dateUtc="2025-08-14T09:39:00Z">
-          <w:pPr>
-            <w:ind w:firstLine="0"/>
-          </w:pPr>
-        </w:pPrChange>
-      </w:pPr>
-      <w:proofErr w:type="gramStart"/>
-      <w:ins w:id="5" w:author="Jaeger, Florian" w:date="2025-08-14T11:36:00Z" w16du:dateUtc="2025-08-14T09:36:00Z">
-        <w:r>
-          <w:rPr>
-            <w:rFonts w:ascii="Times New Roman" w:hAnsi="Times New Roman"/>
-            <w:sz w:val="22"/>
-            <w:szCs w:val="22"/>
-          </w:rPr>
-          <w:t xml:space="preserve">All </w:t>
-        </w:r>
-      </w:ins>
-      <w:ins w:id="6" w:author="Jaeger, Florian" w:date="2025-08-14T11:37:00Z" w16du:dateUtc="2025-08-14T09:37:00Z">
-        <w:r>
-          <w:rPr>
-            <w:rFonts w:ascii="Times New Roman" w:hAnsi="Times New Roman"/>
-            <w:sz w:val="22"/>
-            <w:szCs w:val="22"/>
-          </w:rPr>
-          <w:t>of</w:t>
-        </w:r>
-        <w:proofErr w:type="gramEnd"/>
-        <w:r>
-          <w:rPr>
-            <w:rFonts w:ascii="Times New Roman" w:hAnsi="Times New Roman"/>
-            <w:sz w:val="22"/>
-            <w:szCs w:val="22"/>
-          </w:rPr>
-          <w:t xml:space="preserve"> R2’s other</w:t>
-        </w:r>
-      </w:ins>
-      <w:ins w:id="7" w:author="Jaeger, Florian" w:date="2025-08-14T11:36:00Z" w16du:dateUtc="2025-08-14T09:36:00Z">
-        <w:r>
-          <w:rPr>
-            <w:rFonts w:ascii="Times New Roman" w:hAnsi="Times New Roman"/>
-            <w:sz w:val="22"/>
-            <w:szCs w:val="22"/>
-          </w:rPr>
-          <w:t xml:space="preserve"> comments related to our use of track-changes</w:t>
-        </w:r>
-      </w:ins>
-      <w:ins w:id="8" w:author="Jaeger, Florian" w:date="2025-08-14T11:37:00Z" w16du:dateUtc="2025-08-14T09:37:00Z">
-        <w:r>
-          <w:rPr>
-            <w:rFonts w:ascii="Times New Roman" w:hAnsi="Times New Roman"/>
-            <w:sz w:val="22"/>
-            <w:szCs w:val="22"/>
-          </w:rPr>
-          <w:t>, which we have now removed</w:t>
-        </w:r>
-      </w:ins>
-      <w:ins w:id="9" w:author="Jaeger, Florian" w:date="2025-08-14T11:38:00Z" w16du:dateUtc="2025-08-14T09:38:00Z">
-        <w:r>
-          <w:rPr>
-            <w:rFonts w:ascii="Times New Roman" w:hAnsi="Times New Roman"/>
-            <w:sz w:val="22"/>
-            <w:szCs w:val="22"/>
-          </w:rPr>
-          <w:t>. I</w:t>
-        </w:r>
-      </w:ins>
-      <w:ins w:id="10" w:author="Jaeger, Florian" w:date="2025-08-14T11:37:00Z" w16du:dateUtc="2025-08-14T09:37:00Z">
-        <w:r>
-          <w:rPr>
-            <w:rFonts w:ascii="Times New Roman" w:hAnsi="Times New Roman"/>
-            <w:sz w:val="22"/>
-            <w:szCs w:val="22"/>
-          </w:rPr>
-          <w:t xml:space="preserve">n particular, the revised result </w:t>
-        </w:r>
-      </w:ins>
-      <w:ins w:id="11" w:author="Jaeger, Florian" w:date="2025-08-14T11:38:00Z" w16du:dateUtc="2025-08-14T09:38:00Z">
-        <w:r>
-          <w:rPr>
-            <w:rFonts w:ascii="Times New Roman" w:hAnsi="Times New Roman"/>
-            <w:sz w:val="22"/>
-            <w:szCs w:val="22"/>
-          </w:rPr>
-          <w:t>Figure 4</w:t>
-        </w:r>
-      </w:ins>
-      <w:ins w:id="12" w:author="Jaeger, Florian" w:date="2025-08-14T11:37:00Z" w16du:dateUtc="2025-08-14T09:37:00Z">
-        <w:r>
-          <w:rPr>
-            <w:rFonts w:ascii="Times New Roman" w:hAnsi="Times New Roman"/>
-            <w:sz w:val="22"/>
-            <w:szCs w:val="22"/>
-          </w:rPr>
-          <w:t xml:space="preserve"> for Experiments 1a-c in our previous submission did </w:t>
-        </w:r>
-        <w:r>
-          <w:rPr>
-            <w:rFonts w:ascii="Times New Roman" w:hAnsi="Times New Roman"/>
-            <w:i/>
-            <w:iCs/>
-            <w:sz w:val="22"/>
-            <w:szCs w:val="22"/>
-          </w:rPr>
-          <w:t>not</w:t>
-        </w:r>
-        <w:r>
-          <w:rPr>
-            <w:rFonts w:ascii="Times New Roman" w:hAnsi="Times New Roman"/>
-            <w:sz w:val="22"/>
-            <w:szCs w:val="22"/>
-          </w:rPr>
-          <w:t xml:space="preserve"> contain the additional line that the reviewer was worried about; it had </w:t>
-        </w:r>
-      </w:ins>
-      <w:ins w:id="13" w:author="Jaeger, Florian" w:date="2025-08-14T11:38:00Z" w16du:dateUtc="2025-08-14T09:38:00Z">
-        <w:r>
-          <w:rPr>
-            <w:rFonts w:ascii="Times New Roman" w:hAnsi="Times New Roman"/>
-            <w:sz w:val="22"/>
-            <w:szCs w:val="22"/>
-          </w:rPr>
-          <w:t xml:space="preserve">already </w:t>
-        </w:r>
-      </w:ins>
-      <w:ins w:id="14" w:author="Jaeger, Florian" w:date="2025-08-14T11:37:00Z" w16du:dateUtc="2025-08-14T09:37:00Z">
-        <w:r>
-          <w:rPr>
-            <w:rFonts w:ascii="Times New Roman" w:hAnsi="Times New Roman"/>
-            <w:sz w:val="22"/>
-            <w:szCs w:val="22"/>
-          </w:rPr>
-          <w:t>been removed following R2</w:t>
-        </w:r>
-      </w:ins>
-      <w:ins w:id="15" w:author="Jaeger, Florian" w:date="2025-08-14T11:38:00Z" w16du:dateUtc="2025-08-14T09:38:00Z">
-        <w:r>
-          <w:rPr>
-            <w:rFonts w:ascii="Times New Roman" w:hAnsi="Times New Roman"/>
-            <w:sz w:val="22"/>
-            <w:szCs w:val="22"/>
-          </w:rPr>
-          <w:t>’s request</w:t>
-        </w:r>
-      </w:ins>
-      <w:ins w:id="16" w:author="Jaeger, Florian" w:date="2025-08-14T11:37:00Z" w16du:dateUtc="2025-08-14T09:37:00Z">
-        <w:r>
-          <w:rPr>
-            <w:rFonts w:ascii="Times New Roman" w:hAnsi="Times New Roman"/>
-            <w:sz w:val="22"/>
-            <w:szCs w:val="22"/>
-          </w:rPr>
-          <w:t>.</w:t>
-        </w:r>
-      </w:ins>
-      <w:del w:id="17" w:author="Jaeger, Florian" w:date="2025-08-14T11:35:00Z" w16du:dateUtc="2025-08-14T09:35:00Z">
-        <w:r>
-          <w:rPr>
-            <w:rFonts w:ascii="Times New Roman" w:hAnsi="Times New Roman"/>
-            <w:sz w:val="22"/>
-            <w:szCs w:val="22"/>
-          </w:rPr>
-          <w:delText xml:space="preserve">We are grateful to you and the reviewers for your highly constructive feedback on </w:delText>
-        </w:r>
-        <w:r>
-          <w:rPr>
-            <w:rFonts w:ascii="Times New Roman" w:hAnsi="Times New Roman"/>
-            <w:sz w:val="22"/>
-            <w:szCs w:val="22"/>
-          </w:rPr>
-          <w:delText xml:space="preserve">both </w:delText>
-        </w:r>
-        <w:r>
-          <w:rPr>
-            <w:rFonts w:ascii="Times New Roman" w:hAnsi="Times New Roman"/>
-            <w:sz w:val="22"/>
-            <w:szCs w:val="22"/>
-          </w:rPr>
-          <w:delText>our initial submission</w:delText>
-        </w:r>
-        <w:r>
-          <w:rPr>
-            <w:rFonts w:ascii="Times New Roman" w:hAnsi="Times New Roman"/>
-            <w:sz w:val="22"/>
-            <w:szCs w:val="22"/>
-          </w:rPr>
-          <w:delText xml:space="preserve"> and first revision</w:delText>
-        </w:r>
-        <w:r>
-          <w:rPr>
-            <w:rFonts w:ascii="Times New Roman" w:hAnsi="Times New Roman"/>
-            <w:sz w:val="22"/>
-            <w:szCs w:val="22"/>
-          </w:rPr>
-          <w:delText xml:space="preserve">. </w:delText>
-        </w:r>
-        <w:r>
-          <w:rPr>
-            <w:rFonts w:ascii="Times New Roman" w:hAnsi="Times New Roman"/>
-            <w:sz w:val="22"/>
-            <w:szCs w:val="22"/>
-          </w:rPr>
-          <w:delText xml:space="preserve">Additionally, we are heartened that both reviewers found our responses to their initial feedback to be helpful and thorough. </w:delText>
-        </w:r>
-      </w:del>
-      <w:ins w:id="18" w:author="Jaeger, Florian" w:date="2025-08-14T11:39:00Z" w16du:dateUtc="2025-08-14T09:39:00Z">
-        <w:r>
-          <w:rPr>
-            <w:rFonts w:ascii="Times New Roman" w:hAnsi="Times New Roman"/>
-            <w:sz w:val="22"/>
-            <w:szCs w:val="22"/>
-          </w:rPr>
-          <w:t xml:space="preserve"> </w:t>
-        </w:r>
-      </w:ins>
-    </w:p>
-    <w:p>
-      <w:pPr>
-        <w:ind w:firstLine="0"/>
-        <w:rPr>
-          <w:del w:id="19" w:author="Jaeger, Florian" w:date="2025-08-14T11:39:00Z" w16du:dateUtc="2025-08-14T09:39:00Z"/>
-          <w:rFonts w:ascii="Times New Roman" w:hAnsi="Times New Roman"/>
-          <w:sz w:val="22"/>
-          <w:szCs w:val="22"/>
-        </w:rPr>
-        <w:pPrChange w:id="20" w:author="Jaeger, Florian" w:date="2025-08-14T11:39:00Z" w16du:dateUtc="2025-08-14T09:39:00Z">
-          <w:pPr>
-            <w:ind w:firstLine="0"/>
-          </w:pPr>
-        </w:pPrChange>
-      </w:pPr>
+        <w:t xml:space="preserve">We have removed the two typos identified by R2. </w:t>
+      </w:r>
     </w:p>
     <w:p>
       <w:pPr>
@@ -355,58 +99,42 @@
           <w:szCs w:val="22"/>
         </w:rPr>
       </w:pPr>
-      <w:del w:id="21" w:author="Jaeger, Florian" w:date="2025-08-14T11:39:00Z" w16du:dateUtc="2025-08-14T09:39:00Z">
-        <w:r>
-          <w:rPr>
-            <w:rFonts w:ascii="Times New Roman" w:hAnsi="Times New Roman"/>
-            <w:sz w:val="22"/>
-            <w:szCs w:val="22"/>
-          </w:rPr>
-          <w:delText>R1 recommended the paper in its current form for publication. While R2 identified “</w:delText>
-        </w:r>
-        <w:r>
-          <w:rPr>
-            <w:rFonts w:ascii="Times New Roman" w:hAnsi="Times New Roman"/>
-            <w:sz w:val="22"/>
-            <w:szCs w:val="22"/>
-          </w:rPr>
-          <w:delText>no other substantial comments</w:delText>
-        </w:r>
-        <w:r>
-          <w:rPr>
-            <w:rFonts w:ascii="Times New Roman" w:hAnsi="Times New Roman"/>
-            <w:sz w:val="22"/>
-            <w:szCs w:val="22"/>
-          </w:rPr>
-          <w:delText>”, they did identify two typos and expressed some lack of clarity resultant of the tracked-changes document. We have amended the typos and removed the changes tracking from the revised submission, clarifying that</w:delText>
-        </w:r>
-        <w:r>
-          <w:rPr>
-            <w:rFonts w:ascii="Times New Roman" w:hAnsi="Times New Roman"/>
-            <w:sz w:val="22"/>
-            <w:szCs w:val="22"/>
-          </w:rPr>
-          <w:delText>, for example,</w:delText>
-        </w:r>
-        <w:r>
-          <w:rPr>
-            <w:rFonts w:ascii="Times New Roman" w:hAnsi="Times New Roman"/>
-            <w:sz w:val="22"/>
-            <w:szCs w:val="22"/>
-          </w:rPr>
-          <w:delText xml:space="preserve"> the revised Figure 4 does not include data from a previous experiment. Finally, we have</w:delText>
-        </w:r>
-      </w:del>
-      <w:ins w:id="22" w:author="Jaeger, Florian" w:date="2025-08-14T11:39:00Z" w16du:dateUtc="2025-08-14T09:39:00Z">
-        <w:r>
-          <w:rPr>
-            <w:rFonts w:ascii="Times New Roman" w:hAnsi="Times New Roman"/>
-            <w:sz w:val="22"/>
-            <w:szCs w:val="22"/>
-          </w:rPr>
-          <w:t>We also</w:t>
-        </w:r>
-      </w:ins>
+    </w:p>
+    <w:p>
+      <w:pPr>
+        <w:ind w:firstLine="0"/>
+        <w:rPr>
+          <w:rFonts w:ascii="Times New Roman" w:hAnsi="Times New Roman"/>
+          <w:sz w:val="22"/>
+          <w:szCs w:val="22"/>
+        </w:rPr>
+      </w:pPr>
+      <w:r>
+        <w:rPr>
+          <w:rFonts w:ascii="Times New Roman" w:hAnsi="Times New Roman"/>
+          <w:sz w:val="22"/>
+          <w:szCs w:val="22"/>
+        </w:rPr>
+        <w:t xml:space="preserve">All of R2’s other comments related to our use of track-changes, which we have now removed. In particular, the revised result Figure 4 for Experiments 1a-c in our previous submission did </w:t>
+      </w:r>
+      <w:r>
+        <w:rPr>
+          <w:rFonts w:ascii="Times New Roman" w:hAnsi="Times New Roman"/>
+          <w:i/>
+          <w:iCs/>
+          <w:sz w:val="22"/>
+          <w:szCs w:val="22"/>
+        </w:rPr>
+        <w:t>not</w:t>
+      </w:r>
+      <w:r>
+        <w:rPr>
+          <w:rFonts w:ascii="Times New Roman" w:hAnsi="Times New Roman"/>
+          <w:sz w:val="22"/>
+          <w:szCs w:val="22"/>
+        </w:rPr>
+        <w:t xml:space="preserve"> contain the additional line that the reviewer was worried about; it had already been removed following R2’s request. We also</w:t>
+      </w:r>
       <w:r>
         <w:rPr>
           <w:rFonts w:ascii="Times New Roman" w:hAnsi="Times New Roman"/>
@@ -423,86 +151,47 @@
         </w:rPr>
         <w:t>4 in terms of the differences between the present work and the approach taken in Liu &amp; Jaeger (2018).</w:t>
       </w:r>
-      <w:ins w:id="23" w:author="Jaeger, Florian" w:date="2025-08-14T11:55:00Z" w16du:dateUtc="2025-08-14T09:55:00Z">
-        <w:r>
-          <w:rPr>
-            <w:rFonts w:ascii="Times New Roman" w:hAnsi="Times New Roman"/>
-            <w:sz w:val="22"/>
-            <w:szCs w:val="22"/>
-          </w:rPr>
-          <w:t xml:space="preserve"> Finally, we made some </w:t>
-        </w:r>
-        <w:r>
-          <w:rPr>
-            <w:rFonts w:ascii="Times New Roman" w:hAnsi="Times New Roman"/>
-            <w:sz w:val="22"/>
-            <w:szCs w:val="22"/>
-          </w:rPr>
-          <w:t>very</w:t>
-        </w:r>
-        <w:r>
-          <w:rPr>
-            <w:rFonts w:ascii="Times New Roman" w:hAnsi="Times New Roman"/>
-            <w:sz w:val="22"/>
-            <w:szCs w:val="22"/>
-          </w:rPr>
-          <w:t xml:space="preserve"> minor rewording changes in the introduction and discussion to </w:t>
-        </w:r>
-      </w:ins>
-      <w:ins w:id="24" w:author="Jaeger, Florian" w:date="2025-08-14T11:56:00Z" w16du:dateUtc="2025-08-14T09:56:00Z">
-        <w:r>
-          <w:rPr>
-            <w:rFonts w:ascii="Times New Roman" w:hAnsi="Times New Roman"/>
-            <w:sz w:val="22"/>
-            <w:szCs w:val="22"/>
-          </w:rPr>
-          <w:t>remove ambiguity that we were made aware of by other readers</w:t>
-        </w:r>
-      </w:ins>
-      <w:ins w:id="25" w:author="Jaeger, Florian" w:date="2025-08-14T11:57:00Z" w16du:dateUtc="2025-08-14T09:57:00Z">
-        <w:r>
-          <w:rPr>
-            <w:rFonts w:ascii="Times New Roman" w:hAnsi="Times New Roman"/>
-            <w:sz w:val="22"/>
-            <w:szCs w:val="22"/>
-          </w:rPr>
-          <w:t xml:space="preserve"> (1</w:t>
-        </w:r>
-        <w:r>
-          <w:rPr>
-            <w:rFonts w:ascii="Times New Roman" w:hAnsi="Times New Roman"/>
-            <w:sz w:val="22"/>
-            <w:szCs w:val="22"/>
-            <w:vertAlign w:val="superscript"/>
-            <w:rPrChange w:id="26" w:author="Jaeger, Florian" w:date="2025-08-14T11:57:00Z" w16du:dateUtc="2025-08-14T09:57:00Z">
-              <w:rPr>
-                <w:rFonts w:ascii="Times New Roman" w:hAnsi="Times New Roman"/>
-                <w:sz w:val="22"/>
-                <w:szCs w:val="22"/>
-              </w:rPr>
-            </w:rPrChange>
-          </w:rPr>
-          <w:t>st</w:t>
-        </w:r>
-        <w:r>
-          <w:rPr>
-            <w:rFonts w:ascii="Times New Roman" w:hAnsi="Times New Roman"/>
-            <w:sz w:val="22"/>
-            <w:szCs w:val="22"/>
-          </w:rPr>
-          <w:t xml:space="preserve"> paragraph on p4, last paragraph on p. 30)</w:t>
-        </w:r>
-      </w:ins>
-      <w:ins w:id="27" w:author="Jaeger, Florian" w:date="2025-08-14T11:56:00Z" w16du:dateUtc="2025-08-14T09:56:00Z">
-        <w:r>
-          <w:rPr>
-            <w:rFonts w:ascii="Times New Roman" w:hAnsi="Times New Roman"/>
-            <w:sz w:val="22"/>
-            <w:szCs w:val="22"/>
-          </w:rPr>
-          <w:t>.</w:t>
-        </w:r>
-      </w:ins>
+      <w:r>
+        <w:rPr>
+          <w:rFonts w:ascii="Times New Roman" w:hAnsi="Times New Roman"/>
+          <w:sz w:val="22"/>
+          <w:szCs w:val="22"/>
+        </w:rPr>
+        <w:t xml:space="preserve"> Finally, we made some </w:t>
+      </w:r>
+      <w:r>
+        <w:rPr>
+          <w:rFonts w:ascii="Times New Roman" w:hAnsi="Times New Roman"/>
+          <w:sz w:val="22"/>
+          <w:szCs w:val="22"/>
+        </w:rPr>
+        <w:t>very</w:t>
+      </w:r>
+      <w:r>
+        <w:rPr>
+          <w:rFonts w:ascii="Times New Roman" w:hAnsi="Times New Roman"/>
+          <w:sz w:val="22"/>
+          <w:szCs w:val="22"/>
+        </w:rPr>
+        <w:t xml:space="preserve"> minor rewording changes in the introduction and discussion to remove ambiguity that we were made aware of by other readers (1</w:t>
+      </w:r>
+      <w:r>
+        <w:rPr>
+          <w:rFonts w:ascii="Times New Roman" w:hAnsi="Times New Roman"/>
+          <w:sz w:val="22"/>
+          <w:szCs w:val="22"/>
+          <w:vertAlign w:val="superscript"/>
+        </w:rPr>
+        <w:t>st</w:t>
+      </w:r>
+      <w:r>
+        <w:rPr>
+          <w:rFonts w:ascii="Times New Roman" w:hAnsi="Times New Roman"/>
+          <w:sz w:val="22"/>
+          <w:szCs w:val="22"/>
+        </w:rPr>
+        <w:t xml:space="preserve"> paragraph on p4, last paragraph on p. 30).</w:t>
+      </w:r>
     </w:p>
     <w:p>
       <w:pPr>
@@ -531,26 +220,14 @@
         </w:rPr>
         <w:t xml:space="preserve">We appreciate the opportunity to strengthen this paper further, and hope this revised manuscript is now suitable for publication. </w:t>
       </w:r>
-      <w:ins w:id="28" w:author="Jaeger, Florian" w:date="2025-08-14T11:57:00Z" w16du:dateUtc="2025-08-14T09:57:00Z">
-        <w:r>
-          <w:rPr>
-            <w:rFonts w:ascii="Times New Roman" w:hAnsi="Times New Roman"/>
-            <w:sz w:val="22"/>
-            <w:szCs w:val="22"/>
-          </w:rPr>
-          <w:t>We thank you and the reviewers for the helpful gu</w:t>
-        </w:r>
-      </w:ins>
-      <w:ins w:id="29" w:author="Jaeger, Florian" w:date="2025-08-14T11:58:00Z" w16du:dateUtc="2025-08-14T09:58:00Z">
-        <w:r>
-          <w:rPr>
-            <w:rFonts w:ascii="Times New Roman" w:hAnsi="Times New Roman"/>
-            <w:sz w:val="22"/>
-            <w:szCs w:val="22"/>
-          </w:rPr>
-          <w:t>idance throughout the process.</w:t>
-        </w:r>
-      </w:ins>
+      <w:r>
+        <w:rPr>
+          <w:rFonts w:ascii="Times New Roman" w:hAnsi="Times New Roman"/>
+          <w:sz w:val="22"/>
+          <w:szCs w:val="22"/>
+        </w:rPr>
+        <w:t>We thank you and the reviewers for the helpful guidance throughout the process.</w:t>
+      </w:r>
     </w:p>
     <w:p>
       <w:pPr>
@@ -605,7 +282,25 @@
           <w:sz w:val="22"/>
           <w:szCs w:val="22"/>
         </w:rPr>
-        <w:t xml:space="preserve">Shawn Cummings, Gevher </w:t>
+        <w:t xml:space="preserve">Shawn Cummings, </w:t>
+      </w:r>
+      <w:proofErr w:type="spellStart"/>
+      <w:r>
+        <w:rPr>
+          <w:rFonts w:ascii="Times New Roman" w:hAnsi="Times New Roman"/>
+          <w:sz w:val="22"/>
+          <w:szCs w:val="22"/>
+        </w:rPr>
+        <w:t>Gevher</w:t>
+      </w:r>
+      <w:proofErr w:type="spellEnd"/>
+      <w:r>
+        <w:rPr>
+          <w:rFonts w:ascii="Times New Roman" w:hAnsi="Times New Roman"/>
+          <w:sz w:val="22"/>
+          <w:szCs w:val="22"/>
+        </w:rPr>
+        <w:t xml:space="preserve"> </w:t>
       </w:r>
       <w:proofErr w:type="spellStart"/>
       <w:r>
@@ -623,7 +318,25 @@
           <w:sz w:val="22"/>
           <w:szCs w:val="22"/>
         </w:rPr>
-        <w:t xml:space="preserve">, Menghan Yang, and </w:t>
+        <w:t xml:space="preserve">, </w:t>
+      </w:r>
+      <w:proofErr w:type="spellStart"/>
+      <w:r>
+        <w:rPr>
+          <w:rFonts w:ascii="Times New Roman" w:hAnsi="Times New Roman"/>
+          <w:sz w:val="22"/>
+          <w:szCs w:val="22"/>
+        </w:rPr>
+        <w:t>Menghan</w:t>
+      </w:r>
+      <w:proofErr w:type="spellEnd"/>
+      <w:r>
+        <w:rPr>
+          <w:rFonts w:ascii="Times New Roman" w:hAnsi="Times New Roman"/>
+          <w:sz w:val="22"/>
+          <w:szCs w:val="22"/>
+        </w:rPr>
+        <w:t xml:space="preserve"> Yang, and </w:t>
       </w:r>
       <w:r>
         <w:rPr>
@@ -687,7 +400,7 @@
 </file>
 
 <file path=word/endnotes.xml><?xml version="1.0" encoding="utf-8"?>
-<w:endnotes xmlns:wpc="http://schemas.microsoft.com/office/word/2010/wordprocessingCanvas" xmlns:cx="http://schemas.microsoft.com/office/drawing/2014/chartex" xmlns:cx1="http://schemas.microsoft.com/office/drawing/2015/9/8/chartex" xmlns:cx2="http://schemas.microsoft.com/office/drawing/2015/10/21/chartex" xmlns:cx3="http://schemas.microsoft.com/office/drawing/2016/5/9/chartex" xmlns:cx4="http://schemas.microsoft.com/office/drawing/2016/5/10/chartex" xmlns:cx5="http://schemas.microsoft.com/office/drawing/2016/5/11/chartex" xmlns:cx6="http://schemas.microsoft.com/office/drawing/2016/5/12/chartex" xmlns:cx7="http://schemas.microsoft.com/office/drawing/2016/5/13/chartex" xmlns:cx8="http://schemas.microsoft.com/office/drawing/2016/5/14/chartex" xmlns:mc="http://schemas.openxmlformats.org/markup-compatibility/2006" xmlns:aink="http://schemas.microsoft.com/office/drawing/2016/ink" xmlns:am3d="http://schemas.microsoft.com/office/drawing/2017/model3d" xmlns:o="urn:schemas-microsoft-com:office:office" xmlns:oel="http://schemas.microsoft.com/office/2019/extlst" xmlns:r="http://schemas.openxmlformats.org/officeDocument/2006/relationships" xmlns:m="http://schemas.openxmlformats.org/officeDocument/2006/math" xmlns:v="urn:schemas-microsoft-com:vml" xmlns:wp14="http://schemas.microsoft.com/office/word/2010/wordprocessingDrawing" xmlns:wp="http://schemas.openxmlformats.org/drawingml/2006/wordprocessingDrawing" xmlns:w10="urn:schemas-microsoft-com:office:word" xmlns:w="http://schemas.openxmlformats.org/wordprocessingml/2006/main" xmlns:w14="http://schemas.microsoft.com/office/word/2010/wordml" xmlns:w15="http://schemas.microsoft.com/office/word/2012/wordml" xmlns:w16cex="http://schemas.microsoft.com/office/word/2018/wordml/cex" xmlns:w16cid="http://schemas.microsoft.com/office/word/2016/wordml/cid" xmlns:w16="http://schemas.microsoft.com/office/word/2018/wordml" xmlns:w16du="http://schemas.microsoft.com/office/word/2023/wordml/word16du" xmlns:w16sdtdh="http://schemas.microsoft.com/office/word/2020/wordml/sdtdatahash" xmlns:w16sdtfl="http://schemas.microsoft.com/office/word/2024/wordml/sdtformatlock" xmlns:w16se="http://schemas.microsoft.com/office/word/2015/wordml/symex" xmlns:wpg="http://schemas.microsoft.com/office/word/2010/wordprocessingGroup" xmlns:wpi="http://schemas.microsoft.com/office/word/2010/wordprocessingInk" xmlns:wne="http://schemas.microsoft.com/office/word/2006/wordml" xmlns:wps="http://schemas.microsoft.com/office/word/2010/wordprocessingShape" mc:Ignorable="w14 w15 w16se w16cid w16 w16cex w16sdtdh w16sdtfl w16du wp14">
+<w:endnotes xmlns:wpc="http://schemas.microsoft.com/office/word/2010/wordprocessingCanvas" xmlns:cx="http://schemas.microsoft.com/office/drawing/2014/chartex" xmlns:cx1="http://schemas.microsoft.com/office/drawing/2015/9/8/chartex" xmlns:cx2="http://schemas.microsoft.com/office/drawing/2015/10/21/chartex" xmlns:cx3="http://schemas.microsoft.com/office/drawing/2016/5/9/chartex" xmlns:cx4="http://schemas.microsoft.com/office/drawing/2016/5/10/chartex" xmlns:cx5="http://schemas.microsoft.com/office/drawing/2016/5/11/chartex" xmlns:cx6="http://schemas.microsoft.com/office/drawing/2016/5/12/chartex" xmlns:cx7="http://schemas.microsoft.com/office/drawing/2016/5/13/chartex" xmlns:cx8="http://schemas.microsoft.com/office/drawing/2016/5/14/chartex" xmlns:mc="http://schemas.openxmlformats.org/markup-compatibility/2006" xmlns:aink="http://schemas.microsoft.com/office/drawing/2016/ink" xmlns:am3d="http://schemas.microsoft.com/office/drawing/2017/model3d" xmlns:o="urn:schemas-microsoft-com:office:office" xmlns:oel="http://schemas.microsoft.com/office/2019/extlst" xmlns:r="http://schemas.openxmlformats.org/officeDocument/2006/relationships" xmlns:m="http://schemas.openxmlformats.org/officeDocument/2006/math" xmlns:v="urn:schemas-microsoft-com:vml" xmlns:wp14="http://schemas.microsoft.com/office/word/2010/wordprocessingDrawing" xmlns:wp="http://schemas.openxmlformats.org/drawingml/2006/wordprocessingDrawing" xmlns:w10="urn:schemas-microsoft-com:office:word" xmlns:w="http://schemas.openxmlformats.org/wordprocessingml/2006/main" xmlns:w14="http://schemas.microsoft.com/office/word/2010/wordml" xmlns:w15="http://schemas.microsoft.com/office/word/2012/wordml" xmlns:w16cex="http://schemas.microsoft.com/office/word/2018/wordml/cex" xmlns:w16cid="http://schemas.microsoft.com/office/word/2016/wordml/cid" xmlns:w16="http://schemas.microsoft.com/office/word/2018/wordml" xmlns:w16du="http://schemas.microsoft.com/office/word/2023/wordml/word16du" xmlns:w16sdtdh="http://schemas.microsoft.com/office/word/2020/wordml/sdtdatahash" xmlns:w16se="http://schemas.microsoft.com/office/word/2015/wordml/symex" xmlns:wpg="http://schemas.microsoft.com/office/word/2010/wordprocessingGroup" xmlns:wpi="http://schemas.microsoft.com/office/word/2010/wordprocessingInk" xmlns:wne="http://schemas.microsoft.com/office/word/2006/wordml" xmlns:wps="http://schemas.microsoft.com/office/word/2010/wordprocessingShape" mc:Ignorable="w14 w15 w16se w16cid w16 w16cex w16sdtdh w16du wp14">
   <w:endnote w:type="separator" w:id="-1">
     <w:p>
       <w:r>
@@ -706,7 +419,7 @@
 </file>
 
 <file path=word/footer1.xml><?xml version="1.0" encoding="utf-8"?>
-<w:ftr xmlns:wpc="http://schemas.microsoft.com/office/word/2010/wordprocessingCanvas" xmlns:cx="http://schemas.microsoft.com/office/drawing/2014/chartex" xmlns:cx1="http://schemas.microsoft.com/office/drawing/2015/9/8/chartex" xmlns:cx2="http://schemas.microsoft.com/office/drawing/2015/10/21/chartex" xmlns:cx3="http://schemas.microsoft.com/office/drawing/2016/5/9/chartex" xmlns:cx4="http://schemas.microsoft.com/office/drawing/2016/5/10/chartex" xmlns:cx5="http://schemas.microsoft.com/office/drawing/2016/5/11/chartex" xmlns:cx6="http://schemas.microsoft.com/office/drawing/2016/5/12/chartex" xmlns:cx7="http://schemas.microsoft.com/office/drawing/2016/5/13/chartex" xmlns:cx8="http://schemas.microsoft.com/office/drawing/2016/5/14/chartex" xmlns:mc="http://schemas.openxmlformats.org/markup-compatibility/2006" xmlns:aink="http://schemas.microsoft.com/office/drawing/2016/ink" xmlns:am3d="http://schemas.microsoft.com/office/drawing/2017/model3d" xmlns:o="urn:schemas-microsoft-com:office:office" xmlns:oel="http://schemas.microsoft.com/office/2019/extlst" xmlns:r="http://schemas.openxmlformats.org/officeDocument/2006/relationships" xmlns:m="http://schemas.openxmlformats.org/officeDocument/2006/math" xmlns:v="urn:schemas-microsoft-com:vml" xmlns:wp14="http://schemas.microsoft.com/office/word/2010/wordprocessingDrawing" xmlns:wp="http://schemas.openxmlformats.org/drawingml/2006/wordprocessingDrawing" xmlns:w10="urn:schemas-microsoft-com:office:word" xmlns:w="http://schemas.openxmlformats.org/wordprocessingml/2006/main" xmlns:w14="http://schemas.microsoft.com/office/word/2010/wordml" xmlns:w15="http://schemas.microsoft.com/office/word/2012/wordml" xmlns:w16cex="http://schemas.microsoft.com/office/word/2018/wordml/cex" xmlns:w16cid="http://schemas.microsoft.com/office/word/2016/wordml/cid" xmlns:w16="http://schemas.microsoft.com/office/word/2018/wordml" xmlns:w16du="http://schemas.microsoft.com/office/word/2023/wordml/word16du" xmlns:w16sdtdh="http://schemas.microsoft.com/office/word/2020/wordml/sdtdatahash" xmlns:w16sdtfl="http://schemas.microsoft.com/office/word/2024/wordml/sdtformatlock" xmlns:w16se="http://schemas.microsoft.com/office/word/2015/wordml/symex" xmlns:wpg="http://schemas.microsoft.com/office/word/2010/wordprocessingGroup" xmlns:wpi="http://schemas.microsoft.com/office/word/2010/wordprocessingInk" xmlns:wne="http://schemas.microsoft.com/office/word/2006/wordml" xmlns:wps="http://schemas.microsoft.com/office/word/2010/wordprocessingShape" mc:Ignorable="w14 w15 w16se w16cid w16 w16cex w16sdtdh w16sdtfl w16du wp14">
+<w:ftr xmlns:wpc="http://schemas.microsoft.com/office/word/2010/wordprocessingCanvas" xmlns:cx="http://schemas.microsoft.com/office/drawing/2014/chartex" xmlns:cx1="http://schemas.microsoft.com/office/drawing/2015/9/8/chartex" xmlns:cx2="http://schemas.microsoft.com/office/drawing/2015/10/21/chartex" xmlns:cx3="http://schemas.microsoft.com/office/drawing/2016/5/9/chartex" xmlns:cx4="http://schemas.microsoft.com/office/drawing/2016/5/10/chartex" xmlns:cx5="http://schemas.microsoft.com/office/drawing/2016/5/11/chartex" xmlns:cx6="http://schemas.microsoft.com/office/drawing/2016/5/12/chartex" xmlns:cx7="http://schemas.microsoft.com/office/drawing/2016/5/13/chartex" xmlns:cx8="http://schemas.microsoft.com/office/drawing/2016/5/14/chartex" xmlns:mc="http://schemas.openxmlformats.org/markup-compatibility/2006" xmlns:aink="http://schemas.microsoft.com/office/drawing/2016/ink" xmlns:am3d="http://schemas.microsoft.com/office/drawing/2017/model3d" xmlns:o="urn:schemas-microsoft-com:office:office" xmlns:oel="http://schemas.microsoft.com/office/2019/extlst" xmlns:r="http://schemas.openxmlformats.org/officeDocument/2006/relationships" xmlns:m="http://schemas.openxmlformats.org/officeDocument/2006/math" xmlns:v="urn:schemas-microsoft-com:vml" xmlns:wp14="http://schemas.microsoft.com/office/word/2010/wordprocessingDrawing" xmlns:wp="http://schemas.openxmlformats.org/drawingml/2006/wordprocessingDrawing" xmlns:w10="urn:schemas-microsoft-com:office:word" xmlns:w="http://schemas.openxmlformats.org/wordprocessingml/2006/main" xmlns:w14="http://schemas.microsoft.com/office/word/2010/wordml" xmlns:w15="http://schemas.microsoft.com/office/word/2012/wordml" xmlns:w16cex="http://schemas.microsoft.com/office/word/2018/wordml/cex" xmlns:w16cid="http://schemas.microsoft.com/office/word/2016/wordml/cid" xmlns:w16="http://schemas.microsoft.com/office/word/2018/wordml" xmlns:w16du="http://schemas.microsoft.com/office/word/2023/wordml/word16du" xmlns:w16sdtdh="http://schemas.microsoft.com/office/word/2020/wordml/sdtdatahash" xmlns:w16se="http://schemas.microsoft.com/office/word/2015/wordml/symex" xmlns:wpg="http://schemas.microsoft.com/office/word/2010/wordprocessingGroup" xmlns:wpi="http://schemas.microsoft.com/office/word/2010/wordprocessingInk" xmlns:wne="http://schemas.microsoft.com/office/word/2006/wordml" xmlns:wps="http://schemas.microsoft.com/office/word/2010/wordprocessingShape" mc:Ignorable="w14 w15 w16se w16cid w16 w16cex w16sdtdh w16du wp14">
   <w:p>
     <w:pPr>
       <w:pStyle w:val="Footer"/>
@@ -717,7 +430,7 @@
 </file>
 
 <file path=word/footer2.xml><?xml version="1.0" encoding="utf-8"?>
-<w:ftr xmlns:wpc="http://schemas.microsoft.com/office/word/2010/wordprocessingCanvas" xmlns:cx="http://schemas.microsoft.com/office/drawing/2014/chartex" xmlns:cx1="http://schemas.microsoft.com/office/drawing/2015/9/8/chartex" xmlns:cx2="http://schemas.microsoft.com/office/drawing/2015/10/21/chartex" xmlns:cx3="http://schemas.microsoft.com/office/drawing/2016/5/9/chartex" xmlns:cx4="http://schemas.microsoft.com/office/drawing/2016/5/10/chartex" xmlns:cx5="http://schemas.microsoft.com/office/drawing/2016/5/11/chartex" xmlns:cx6="http://schemas.microsoft.com/office/drawing/2016/5/12/chartex" xmlns:cx7="http://schemas.microsoft.com/office/drawing/2016/5/13/chartex" xmlns:cx8="http://schemas.microsoft.com/office/drawing/2016/5/14/chartex" xmlns:mc="http://schemas.openxmlformats.org/markup-compatibility/2006" xmlns:aink="http://schemas.microsoft.com/office/drawing/2016/ink" xmlns:am3d="http://schemas.microsoft.com/office/drawing/2017/model3d" xmlns:o="urn:schemas-microsoft-com:office:office" xmlns:oel="http://schemas.microsoft.com/office/2019/extlst" xmlns:r="http://schemas.openxmlformats.org/officeDocument/2006/relationships" xmlns:m="http://schemas.openxmlformats.org/officeDocument/2006/math" xmlns:v="urn:schemas-microsoft-com:vml" xmlns:wp14="http://schemas.microsoft.com/office/word/2010/wordprocessingDrawing" xmlns:wp="http://schemas.openxmlformats.org/drawingml/2006/wordprocessingDrawing" xmlns:w10="urn:schemas-microsoft-com:office:word" xmlns:w="http://schemas.openxmlformats.org/wordprocessingml/2006/main" xmlns:w14="http://schemas.microsoft.com/office/word/2010/wordml" xmlns:w15="http://schemas.microsoft.com/office/word/2012/wordml" xmlns:w16cex="http://schemas.microsoft.com/office/word/2018/wordml/cex" xmlns:w16cid="http://schemas.microsoft.com/office/word/2016/wordml/cid" xmlns:w16="http://schemas.microsoft.com/office/word/2018/wordml" xmlns:w16du="http://schemas.microsoft.com/office/word/2023/wordml/word16du" xmlns:w16sdtdh="http://schemas.microsoft.com/office/word/2020/wordml/sdtdatahash" xmlns:w16sdtfl="http://schemas.microsoft.com/office/word/2024/wordml/sdtformatlock" xmlns:w16se="http://schemas.microsoft.com/office/word/2015/wordml/symex" xmlns:wpg="http://schemas.microsoft.com/office/word/2010/wordprocessingGroup" xmlns:wpi="http://schemas.microsoft.com/office/word/2010/wordprocessingInk" xmlns:wne="http://schemas.microsoft.com/office/word/2006/wordml" xmlns:wps="http://schemas.microsoft.com/office/word/2010/wordprocessingShape" mc:Ignorable="w14 w15 w16se w16cid w16 w16cex w16sdtdh w16sdtfl w16du wp14">
+<w:ftr xmlns:wpc="http://schemas.microsoft.com/office/word/2010/wordprocessingCanvas" xmlns:cx="http://schemas.microsoft.com/office/drawing/2014/chartex" xmlns:cx1="http://schemas.microsoft.com/office/drawing/2015/9/8/chartex" xmlns:cx2="http://schemas.microsoft.com/office/drawing/2015/10/21/chartex" xmlns:cx3="http://schemas.microsoft.com/office/drawing/2016/5/9/chartex" xmlns:cx4="http://schemas.microsoft.com/office/drawing/2016/5/10/chartex" xmlns:cx5="http://schemas.microsoft.com/office/drawing/2016/5/11/chartex" xmlns:cx6="http://schemas.microsoft.com/office/drawing/2016/5/12/chartex" xmlns:cx7="http://schemas.microsoft.com/office/drawing/2016/5/13/chartex" xmlns:cx8="http://schemas.microsoft.com/office/drawing/2016/5/14/chartex" xmlns:mc="http://schemas.openxmlformats.org/markup-compatibility/2006" xmlns:aink="http://schemas.microsoft.com/office/drawing/2016/ink" xmlns:am3d="http://schemas.microsoft.com/office/drawing/2017/model3d" xmlns:o="urn:schemas-microsoft-com:office:office" xmlns:oel="http://schemas.microsoft.com/office/2019/extlst" xmlns:r="http://schemas.openxmlformats.org/officeDocument/2006/relationships" xmlns:m="http://schemas.openxmlformats.org/officeDocument/2006/math" xmlns:v="urn:schemas-microsoft-com:vml" xmlns:wp14="http://schemas.microsoft.com/office/word/2010/wordprocessingDrawing" xmlns:wp="http://schemas.openxmlformats.org/drawingml/2006/wordprocessingDrawing" xmlns:w10="urn:schemas-microsoft-com:office:word" xmlns:w="http://schemas.openxmlformats.org/wordprocessingml/2006/main" xmlns:w14="http://schemas.microsoft.com/office/word/2010/wordml" xmlns:w15="http://schemas.microsoft.com/office/word/2012/wordml" xmlns:w16cex="http://schemas.microsoft.com/office/word/2018/wordml/cex" xmlns:w16cid="http://schemas.microsoft.com/office/word/2016/wordml/cid" xmlns:w16="http://schemas.microsoft.com/office/word/2018/wordml" xmlns:w16du="http://schemas.microsoft.com/office/word/2023/wordml/word16du" xmlns:w16sdtdh="http://schemas.microsoft.com/office/word/2020/wordml/sdtdatahash" xmlns:w16se="http://schemas.microsoft.com/office/word/2015/wordml/symex" xmlns:wpg="http://schemas.microsoft.com/office/word/2010/wordprocessingGroup" xmlns:wpi="http://schemas.microsoft.com/office/word/2010/wordprocessingInk" xmlns:wne="http://schemas.microsoft.com/office/word/2006/wordml" xmlns:wps="http://schemas.microsoft.com/office/word/2010/wordprocessingShape" mc:Ignorable="w14 w15 w16se w16cid w16 w16cex w16sdtdh w16du wp14">
   <w:p>
     <w:pPr>
       <w:ind w:firstLine="0"/>
@@ -940,7 +653,7 @@
 </file>
 
 <file path=word/footnotes.xml><?xml version="1.0" encoding="utf-8"?>
-<w:footnotes xmlns:wpc="http://schemas.microsoft.com/office/word/2010/wordprocessingCanvas" xmlns:cx="http://schemas.microsoft.com/office/drawing/2014/chartex" xmlns:cx1="http://schemas.microsoft.com/office/drawing/2015/9/8/chartex" xmlns:cx2="http://schemas.microsoft.com/office/drawing/2015/10/21/chartex" xmlns:cx3="http://schemas.microsoft.com/office/drawing/2016/5/9/chartex" xmlns:cx4="http://schemas.microsoft.com/office/drawing/2016/5/10/chartex" xmlns:cx5="http://schemas.microsoft.com/office/drawing/2016/5/11/chartex" xmlns:cx6="http://schemas.microsoft.com/office/drawing/2016/5/12/chartex" xmlns:cx7="http://schemas.microsoft.com/office/drawing/2016/5/13/chartex" xmlns:cx8="http://schemas.microsoft.com/office/drawing/2016/5/14/chartex" xmlns:mc="http://schemas.openxmlformats.org/markup-compatibility/2006" xmlns:aink="http://schemas.microsoft.com/office/drawing/2016/ink" xmlns:am3d="http://schemas.microsoft.com/office/drawing/2017/model3d" xmlns:o="urn:schemas-microsoft-com:office:office" xmlns:oel="http://schemas.microsoft.com/office/2019/extlst" xmlns:r="http://schemas.openxmlformats.org/officeDocument/2006/relationships" xmlns:m="http://schemas.openxmlformats.org/officeDocument/2006/math" xmlns:v="urn:schemas-microsoft-com:vml" xmlns:wp14="http://schemas.microsoft.com/office/word/2010/wordprocessingDrawing" xmlns:wp="http://schemas.openxmlformats.org/drawingml/2006/wordprocessingDrawing" xmlns:w10="urn:schemas-microsoft-com:office:word" xmlns:w="http://schemas.openxmlformats.org/wordprocessingml/2006/main" xmlns:w14="http://schemas.microsoft.com/office/word/2010/wordml" xmlns:w15="http://schemas.microsoft.com/office/word/2012/wordml" xmlns:w16cex="http://schemas.microsoft.com/office/word/2018/wordml/cex" xmlns:w16cid="http://schemas.microsoft.com/office/word/2016/wordml/cid" xmlns:w16="http://schemas.microsoft.com/office/word/2018/wordml" xmlns:w16du="http://schemas.microsoft.com/office/word/2023/wordml/word16du" xmlns:w16sdtdh="http://schemas.microsoft.com/office/word/2020/wordml/sdtdatahash" xmlns:w16sdtfl="http://schemas.microsoft.com/office/word/2024/wordml/sdtformatlock" xmlns:w16se="http://schemas.microsoft.com/office/word/2015/wordml/symex" xmlns:wpg="http://schemas.microsoft.com/office/word/2010/wordprocessingGroup" xmlns:wpi="http://schemas.microsoft.com/office/word/2010/wordprocessingInk" xmlns:wne="http://schemas.microsoft.com/office/word/2006/wordml" xmlns:wps="http://schemas.microsoft.com/office/word/2010/wordprocessingShape" mc:Ignorable="w14 w15 w16se w16cid w16 w16cex w16sdtdh w16sdtfl w16du wp14">
+<w:footnotes xmlns:wpc="http://schemas.microsoft.com/office/word/2010/wordprocessingCanvas" xmlns:cx="http://schemas.microsoft.com/office/drawing/2014/chartex" xmlns:cx1="http://schemas.microsoft.com/office/drawing/2015/9/8/chartex" xmlns:cx2="http://schemas.microsoft.com/office/drawing/2015/10/21/chartex" xmlns:cx3="http://schemas.microsoft.com/office/drawing/2016/5/9/chartex" xmlns:cx4="http://schemas.microsoft.com/office/drawing/2016/5/10/chartex" xmlns:cx5="http://schemas.microsoft.com/office/drawing/2016/5/11/chartex" xmlns:cx6="http://schemas.microsoft.com/office/drawing/2016/5/12/chartex" xmlns:cx7="http://schemas.microsoft.com/office/drawing/2016/5/13/chartex" xmlns:cx8="http://schemas.microsoft.com/office/drawing/2016/5/14/chartex" xmlns:mc="http://schemas.openxmlformats.org/markup-compatibility/2006" xmlns:aink="http://schemas.microsoft.com/office/drawing/2016/ink" xmlns:am3d="http://schemas.microsoft.com/office/drawing/2017/model3d" xmlns:o="urn:schemas-microsoft-com:office:office" xmlns:oel="http://schemas.microsoft.com/office/2019/extlst" xmlns:r="http://schemas.openxmlformats.org/officeDocument/2006/relationships" xmlns:m="http://schemas.openxmlformats.org/officeDocument/2006/math" xmlns:v="urn:schemas-microsoft-com:vml" xmlns:wp14="http://schemas.microsoft.com/office/word/2010/wordprocessingDrawing" xmlns:wp="http://schemas.openxmlformats.org/drawingml/2006/wordprocessingDrawing" xmlns:w10="urn:schemas-microsoft-com:office:word" xmlns:w="http://schemas.openxmlformats.org/wordprocessingml/2006/main" xmlns:w14="http://schemas.microsoft.com/office/word/2010/wordml" xmlns:w15="http://schemas.microsoft.com/office/word/2012/wordml" xmlns:w16cex="http://schemas.microsoft.com/office/word/2018/wordml/cex" xmlns:w16cid="http://schemas.microsoft.com/office/word/2016/wordml/cid" xmlns:w16="http://schemas.microsoft.com/office/word/2018/wordml" xmlns:w16du="http://schemas.microsoft.com/office/word/2023/wordml/word16du" xmlns:w16sdtdh="http://schemas.microsoft.com/office/word/2020/wordml/sdtdatahash" xmlns:w16se="http://schemas.microsoft.com/office/word/2015/wordml/symex" xmlns:wpg="http://schemas.microsoft.com/office/word/2010/wordprocessingGroup" xmlns:wpi="http://schemas.microsoft.com/office/word/2010/wordprocessingInk" xmlns:wne="http://schemas.microsoft.com/office/word/2006/wordml" xmlns:wps="http://schemas.microsoft.com/office/word/2010/wordprocessingShape" mc:Ignorable="w14 w15 w16se w16cid w16 w16cex w16sdtdh w16du wp14">
   <w:footnote w:type="separator" w:id="-1">
     <w:p>
       <w:r>
@@ -959,7 +672,7 @@
 </file>
 
 <file path=word/header1.xml><?xml version="1.0" encoding="utf-8"?>
-<w:hdr xmlns:wpc="http://schemas.microsoft.com/office/word/2010/wordprocessingCanvas" xmlns:cx="http://schemas.microsoft.com/office/drawing/2014/chartex" xmlns:cx1="http://schemas.microsoft.com/office/drawing/2015/9/8/chartex" xmlns:cx2="http://schemas.microsoft.com/office/drawing/2015/10/21/chartex" xmlns:cx3="http://schemas.microsoft.com/office/drawing/2016/5/9/chartex" xmlns:cx4="http://schemas.microsoft.com/office/drawing/2016/5/10/chartex" xmlns:cx5="http://schemas.microsoft.com/office/drawing/2016/5/11/chartex" xmlns:cx6="http://schemas.microsoft.com/office/drawing/2016/5/12/chartex" xmlns:cx7="http://schemas.microsoft.com/office/drawing/2016/5/13/chartex" xmlns:cx8="http://schemas.microsoft.com/office/drawing/2016/5/14/chartex" xmlns:mc="http://schemas.openxmlformats.org/markup-compatibility/2006" xmlns:aink="http://schemas.microsoft.com/office/drawing/2016/ink" xmlns:am3d="http://schemas.microsoft.com/office/drawing/2017/model3d" xmlns:o="urn:schemas-microsoft-com:office:office" xmlns:oel="http://schemas.microsoft.com/office/2019/extlst" xmlns:r="http://schemas.openxmlformats.org/officeDocument/2006/relationships" xmlns:m="http://schemas.openxmlformats.org/officeDocument/2006/math" xmlns:v="urn:schemas-microsoft-com:vml" xmlns:wp14="http://schemas.microsoft.com/office/word/2010/wordprocessingDrawing" xmlns:wp="http://schemas.openxmlformats.org/drawingml/2006/wordprocessingDrawing" xmlns:w10="urn:schemas-microsoft-com:office:word" xmlns:w="http://schemas.openxmlformats.org/wordprocessingml/2006/main" xmlns:w14="http://schemas.microsoft.com/office/word/2010/wordml" xmlns:w15="http://schemas.microsoft.com/office/word/2012/wordml" xmlns:w16cex="http://schemas.microsoft.com/office/word/2018/wordml/cex" xmlns:w16cid="http://schemas.microsoft.com/office/word/2016/wordml/cid" xmlns:w16="http://schemas.microsoft.com/office/word/2018/wordml" xmlns:w16du="http://schemas.microsoft.com/office/word/2023/wordml/word16du" xmlns:w16sdtdh="http://schemas.microsoft.com/office/word/2020/wordml/sdtdatahash" xmlns:w16sdtfl="http://schemas.microsoft.com/office/word/2024/wordml/sdtformatlock" xmlns:w16se="http://schemas.microsoft.com/office/word/2015/wordml/symex" xmlns:wpg="http://schemas.microsoft.com/office/word/2010/wordprocessingGroup" xmlns:wpi="http://schemas.microsoft.com/office/word/2010/wordprocessingInk" xmlns:wne="http://schemas.microsoft.com/office/word/2006/wordml" xmlns:wps="http://schemas.microsoft.com/office/word/2010/wordprocessingShape" mc:Ignorable="w14 w15 w16se w16cid w16 w16cex w16sdtdh w16sdtfl w16du wp14">
+<w:hdr xmlns:wpc="http://schemas.microsoft.com/office/word/2010/wordprocessingCanvas" xmlns:cx="http://schemas.microsoft.com/office/drawing/2014/chartex" xmlns:cx1="http://schemas.microsoft.com/office/drawing/2015/9/8/chartex" xmlns:cx2="http://schemas.microsoft.com/office/drawing/2015/10/21/chartex" xmlns:cx3="http://schemas.microsoft.com/office/drawing/2016/5/9/chartex" xmlns:cx4="http://schemas.microsoft.com/office/drawing/2016/5/10/chartex" xmlns:cx5="http://schemas.microsoft.com/office/drawing/2016/5/11/chartex" xmlns:cx6="http://schemas.microsoft.com/office/drawing/2016/5/12/chartex" xmlns:cx7="http://schemas.microsoft.com/office/drawing/2016/5/13/chartex" xmlns:cx8="http://schemas.microsoft.com/office/drawing/2016/5/14/chartex" xmlns:mc="http://schemas.openxmlformats.org/markup-compatibility/2006" xmlns:aink="http://schemas.microsoft.com/office/drawing/2016/ink" xmlns:am3d="http://schemas.microsoft.com/office/drawing/2017/model3d" xmlns:o="urn:schemas-microsoft-com:office:office" xmlns:oel="http://schemas.microsoft.com/office/2019/extlst" xmlns:r="http://schemas.openxmlformats.org/officeDocument/2006/relationships" xmlns:m="http://schemas.openxmlformats.org/officeDocument/2006/math" xmlns:v="urn:schemas-microsoft-com:vml" xmlns:wp14="http://schemas.microsoft.com/office/word/2010/wordprocessingDrawing" xmlns:wp="http://schemas.openxmlformats.org/drawingml/2006/wordprocessingDrawing" xmlns:w10="urn:schemas-microsoft-com:office:word" xmlns:w="http://schemas.openxmlformats.org/wordprocessingml/2006/main" xmlns:w14="http://schemas.microsoft.com/office/word/2010/wordml" xmlns:w15="http://schemas.microsoft.com/office/word/2012/wordml" xmlns:w16cex="http://schemas.microsoft.com/office/word/2018/wordml/cex" xmlns:w16cid="http://schemas.microsoft.com/office/word/2016/wordml/cid" xmlns:w16="http://schemas.microsoft.com/office/word/2018/wordml" xmlns:w16du="http://schemas.microsoft.com/office/word/2023/wordml/word16du" xmlns:w16sdtdh="http://schemas.microsoft.com/office/word/2020/wordml/sdtdatahash" xmlns:w16se="http://schemas.microsoft.com/office/word/2015/wordml/symex" xmlns:wpg="http://schemas.microsoft.com/office/word/2010/wordprocessingGroup" xmlns:wpi="http://schemas.microsoft.com/office/word/2010/wordprocessingInk" xmlns:wne="http://schemas.microsoft.com/office/word/2006/wordml" xmlns:wps="http://schemas.microsoft.com/office/word/2010/wordprocessingShape" mc:Ignorable="w14 w15 w16se w16cid w16 w16cex w16sdtdh w16du wp14">
   <w:p>
     <w:pPr>
       <w:pStyle w:val="Header"/>
@@ -970,7 +683,7 @@
 </file>
 
 <file path=word/header2.xml><?xml version="1.0" encoding="utf-8"?>
-<w:hdr xmlns:wpc="http://schemas.microsoft.com/office/word/2010/wordprocessingCanvas" xmlns:cx="http://schemas.microsoft.com/office/drawing/2014/chartex" xmlns:cx1="http://schemas.microsoft.com/office/drawing/2015/9/8/chartex" xmlns:cx2="http://schemas.microsoft.com/office/drawing/2015/10/21/chartex" xmlns:cx3="http://schemas.microsoft.com/office/drawing/2016/5/9/chartex" xmlns:cx4="http://schemas.microsoft.com/office/drawing/2016/5/10/chartex" xmlns:cx5="http://schemas.microsoft.com/office/drawing/2016/5/11/chartex" xmlns:cx6="http://schemas.microsoft.com/office/drawing/2016/5/12/chartex" xmlns:cx7="http://schemas.microsoft.com/office/drawing/2016/5/13/chartex" xmlns:cx8="http://schemas.microsoft.com/office/drawing/2016/5/14/chartex" xmlns:mc="http://schemas.openxmlformats.org/markup-compatibility/2006" xmlns:aink="http://schemas.microsoft.com/office/drawing/2016/ink" xmlns:am3d="http://schemas.microsoft.com/office/drawing/2017/model3d" xmlns:o="urn:schemas-microsoft-com:office:office" xmlns:oel="http://schemas.microsoft.com/office/2019/extlst" xmlns:r="http://schemas.openxmlformats.org/officeDocument/2006/relationships" xmlns:m="http://schemas.openxmlformats.org/officeDocument/2006/math" xmlns:v="urn:schemas-microsoft-com:vml" xmlns:wp14="http://schemas.microsoft.com/office/word/2010/wordprocessingDrawing" xmlns:wp="http://schemas.openxmlformats.org/drawingml/2006/wordprocessingDrawing" xmlns:w10="urn:schemas-microsoft-com:office:word" xmlns:w="http://schemas.openxmlformats.org/wordprocessingml/2006/main" xmlns:w14="http://schemas.microsoft.com/office/word/2010/wordml" xmlns:w15="http://schemas.microsoft.com/office/word/2012/wordml" xmlns:w16cex="http://schemas.microsoft.com/office/word/2018/wordml/cex" xmlns:w16cid="http://schemas.microsoft.com/office/word/2016/wordml/cid" xmlns:w16="http://schemas.microsoft.com/office/word/2018/wordml" xmlns:w16du="http://schemas.microsoft.com/office/word/2023/wordml/word16du" xmlns:w16sdtdh="http://schemas.microsoft.com/office/word/2020/wordml/sdtdatahash" xmlns:w16sdtfl="http://schemas.microsoft.com/office/word/2024/wordml/sdtformatlock" xmlns:w16se="http://schemas.microsoft.com/office/word/2015/wordml/symex" xmlns:wpg="http://schemas.microsoft.com/office/word/2010/wordprocessingGroup" xmlns:wpi="http://schemas.microsoft.com/office/word/2010/wordprocessingInk" xmlns:wne="http://schemas.microsoft.com/office/word/2006/wordml" xmlns:wps="http://schemas.microsoft.com/office/word/2010/wordprocessingShape" mc:Ignorable="w14 w15 w16se w16cid w16 w16cex w16sdtdh w16sdtfl w16du wp14">
+<w:hdr xmlns:wpc="http://schemas.microsoft.com/office/word/2010/wordprocessingCanvas" xmlns:cx="http://schemas.microsoft.com/office/drawing/2014/chartex" xmlns:cx1="http://schemas.microsoft.com/office/drawing/2015/9/8/chartex" xmlns:cx2="http://schemas.microsoft.com/office/drawing/2015/10/21/chartex" xmlns:cx3="http://schemas.microsoft.com/office/drawing/2016/5/9/chartex" xmlns:cx4="http://schemas.microsoft.com/office/drawing/2016/5/10/chartex" xmlns:cx5="http://schemas.microsoft.com/office/drawing/2016/5/11/chartex" xmlns:cx6="http://schemas.microsoft.com/office/drawing/2016/5/12/chartex" xmlns:cx7="http://schemas.microsoft.com/office/drawing/2016/5/13/chartex" xmlns:cx8="http://schemas.microsoft.com/office/drawing/2016/5/14/chartex" xmlns:mc="http://schemas.openxmlformats.org/markup-compatibility/2006" xmlns:aink="http://schemas.microsoft.com/office/drawing/2016/ink" xmlns:am3d="http://schemas.microsoft.com/office/drawing/2017/model3d" xmlns:o="urn:schemas-microsoft-com:office:office" xmlns:oel="http://schemas.microsoft.com/office/2019/extlst" xmlns:r="http://schemas.openxmlformats.org/officeDocument/2006/relationships" xmlns:m="http://schemas.openxmlformats.org/officeDocument/2006/math" xmlns:v="urn:schemas-microsoft-com:vml" xmlns:wp14="http://schemas.microsoft.com/office/word/2010/wordprocessingDrawing" xmlns:wp="http://schemas.openxmlformats.org/drawingml/2006/wordprocessingDrawing" xmlns:w10="urn:schemas-microsoft-com:office:word" xmlns:w="http://schemas.openxmlformats.org/wordprocessingml/2006/main" xmlns:w14="http://schemas.microsoft.com/office/word/2010/wordml" xmlns:w15="http://schemas.microsoft.com/office/word/2012/wordml" xmlns:w16cex="http://schemas.microsoft.com/office/word/2018/wordml/cex" xmlns:w16cid="http://schemas.microsoft.com/office/word/2016/wordml/cid" xmlns:w16="http://schemas.microsoft.com/office/word/2018/wordml" xmlns:w16du="http://schemas.microsoft.com/office/word/2023/wordml/word16du" xmlns:w16sdtdh="http://schemas.microsoft.com/office/word/2020/wordml/sdtdatahash" xmlns:w16se="http://schemas.microsoft.com/office/word/2015/wordml/symex" xmlns:wpg="http://schemas.microsoft.com/office/word/2010/wordprocessingGroup" xmlns:wpi="http://schemas.microsoft.com/office/word/2010/wordprocessingInk" xmlns:wne="http://schemas.microsoft.com/office/word/2006/wordml" xmlns:wps="http://schemas.microsoft.com/office/word/2010/wordprocessingShape" mc:Ignorable="w14 w15 w16se w16cid w16 w16cex w16sdtdh w16du wp14">
   <w:p>
     <w:pPr>
       <w:rPr>
@@ -1055,7 +768,7 @@
             </wp:anchor>
           </w:drawing>
         </mc:Choice>
-        <mc:Fallback>
+        <mc:Fallback xmlns:w16sdtfl="http://schemas.microsoft.com/office/word/2024/wordml/sdtformatlock">
           <w:pict>
             <v:line w14:anchorId="07E8BC8B" id="Line 3" o:spid="_x0000_s1026" style="position:absolute;z-index:251657216;visibility:visible;mso-wrap-style:square;mso-width-percent:0;mso-height-percent:0;mso-wrap-distance-left:9pt;mso-wrap-distance-top:0;mso-wrap-distance-right:9pt;mso-wrap-distance-bottom:0;mso-position-horizontal:absolute;mso-position-horizontal-relative:text;mso-position-vertical:absolute;mso-position-vertical-relative:text;mso-width-percent:0;mso-height-percent:0;mso-width-relative:page;mso-height-relative:page" from="-.95pt,6.4pt" to="434.55pt,6.4pt" o:gfxdata="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" strokecolor="#001b60" strokeweight="2.25pt">
               <o:lock v:ext="edit" shapetype="f"/>
@@ -1189,7 +902,7 @@
 </file>
 
 <file path=word/numbering.xml><?xml version="1.0" encoding="utf-8"?>
-<w:numbering xmlns:wpc="http://schemas.microsoft.com/office/word/2010/wordprocessingCanvas" xmlns:cx="http://schemas.microsoft.com/office/drawing/2014/chartex" xmlns:cx1="http://schemas.microsoft.com/office/drawing/2015/9/8/chartex" xmlns:cx2="http://schemas.microsoft.com/office/drawing/2015/10/21/chartex" xmlns:cx3="http://schemas.microsoft.com/office/drawing/2016/5/9/chartex" xmlns:cx4="http://schemas.microsoft.com/office/drawing/2016/5/10/chartex" xmlns:cx5="http://schemas.microsoft.com/office/drawing/2016/5/11/chartex" xmlns:cx6="http://schemas.microsoft.com/office/drawing/2016/5/12/chartex" xmlns:cx7="http://schemas.microsoft.com/office/drawing/2016/5/13/chartex" xmlns:cx8="http://schemas.microsoft.com/office/drawing/2016/5/14/chartex" xmlns:mc="http://schemas.openxmlformats.org/markup-compatibility/2006" xmlns:aink="http://schemas.microsoft.com/office/drawing/2016/ink" xmlns:am3d="http://schemas.microsoft.com/office/drawing/2017/model3d" xmlns:o="urn:schemas-microsoft-com:office:office" xmlns:oel="http://schemas.microsoft.com/office/2019/extlst" xmlns:r="http://schemas.openxmlformats.org/officeDocument/2006/relationships" xmlns:m="http://schemas.openxmlformats.org/officeDocument/2006/math" xmlns:v="urn:schemas-microsoft-com:vml" xmlns:wp14="http://schemas.microsoft.com/office/word/2010/wordprocessingDrawing" xmlns:wp="http://schemas.openxmlformats.org/drawingml/2006/wordprocessingDrawing" xmlns:w10="urn:schemas-microsoft-com:office:word" xmlns:w="http://schemas.openxmlformats.org/wordprocessingml/2006/main" xmlns:w14="http://schemas.microsoft.com/office/word/2010/wordml" xmlns:w15="http://schemas.microsoft.com/office/word/2012/wordml" xmlns:w16cex="http://schemas.microsoft.com/office/word/2018/wordml/cex" xmlns:w16cid="http://schemas.microsoft.com/office/word/2016/wordml/cid" xmlns:w16="http://schemas.microsoft.com/office/word/2018/wordml" xmlns:w16du="http://schemas.microsoft.com/office/word/2023/wordml/word16du" xmlns:w16sdtdh="http://schemas.microsoft.com/office/word/2020/wordml/sdtdatahash" xmlns:w16sdtfl="http://schemas.microsoft.com/office/word/2024/wordml/sdtformatlock" xmlns:w16se="http://schemas.microsoft.com/office/word/2015/wordml/symex" xmlns:wpg="http://schemas.microsoft.com/office/word/2010/wordprocessingGroup" xmlns:wpi="http://schemas.microsoft.com/office/word/2010/wordprocessingInk" xmlns:wne="http://schemas.microsoft.com/office/word/2006/wordml" xmlns:wps="http://schemas.microsoft.com/office/word/2010/wordprocessingShape" mc:Ignorable="w14 w15 w16se w16cid w16 w16cex w16sdtdh w16sdtfl w16du wp14">
+<w:numbering xmlns:wpc="http://schemas.microsoft.com/office/word/2010/wordprocessingCanvas" xmlns:cx="http://schemas.microsoft.com/office/drawing/2014/chartex" xmlns:cx1="http://schemas.microsoft.com/office/drawing/2015/9/8/chartex" xmlns:cx2="http://schemas.microsoft.com/office/drawing/2015/10/21/chartex" xmlns:cx3="http://schemas.microsoft.com/office/drawing/2016/5/9/chartex" xmlns:cx4="http://schemas.microsoft.com/office/drawing/2016/5/10/chartex" xmlns:cx5="http://schemas.microsoft.com/office/drawing/2016/5/11/chartex" xmlns:cx6="http://schemas.microsoft.com/office/drawing/2016/5/12/chartex" xmlns:cx7="http://schemas.microsoft.com/office/drawing/2016/5/13/chartex" xmlns:cx8="http://schemas.microsoft.com/office/drawing/2016/5/14/chartex" xmlns:mc="http://schemas.openxmlformats.org/markup-compatibility/2006" xmlns:aink="http://schemas.microsoft.com/office/drawing/2016/ink" xmlns:am3d="http://schemas.microsoft.com/office/drawing/2017/model3d" xmlns:o="urn:schemas-microsoft-com:office:office" xmlns:oel="http://schemas.microsoft.com/office/2019/extlst" xmlns:r="http://schemas.openxmlformats.org/officeDocument/2006/relationships" xmlns:m="http://schemas.openxmlformats.org/officeDocument/2006/math" xmlns:v="urn:schemas-microsoft-com:vml" xmlns:wp14="http://schemas.microsoft.com/office/word/2010/wordprocessingDrawing" xmlns:wp="http://schemas.openxmlformats.org/drawingml/2006/wordprocessingDrawing" xmlns:w10="urn:schemas-microsoft-com:office:word" xmlns:w="http://schemas.openxmlformats.org/wordprocessingml/2006/main" xmlns:w14="http://schemas.microsoft.com/office/word/2010/wordml" xmlns:w15="http://schemas.microsoft.com/office/word/2012/wordml" xmlns:w16cex="http://schemas.microsoft.com/office/word/2018/wordml/cex" xmlns:w16cid="http://schemas.microsoft.com/office/word/2016/wordml/cid" xmlns:w16="http://schemas.microsoft.com/office/word/2018/wordml" xmlns:w16du="http://schemas.microsoft.com/office/word/2023/wordml/word16du" xmlns:w16sdtdh="http://schemas.microsoft.com/office/word/2020/wordml/sdtdatahash" xmlns:w16se="http://schemas.microsoft.com/office/word/2015/wordml/symex" xmlns:wpg="http://schemas.microsoft.com/office/word/2010/wordprocessingGroup" xmlns:wpi="http://schemas.microsoft.com/office/word/2010/wordprocessingInk" xmlns:wne="http://schemas.microsoft.com/office/word/2006/wordml" xmlns:wps="http://schemas.microsoft.com/office/word/2010/wordprocessingShape" mc:Ignorable="w14 w15 w16se w16cid w16 w16cex w16sdtdh w16du wp14">
   <w:abstractNum w:abstractNumId="0" w15:restartNumberingAfterBreak="0">
     <w:nsid w:val="FFFFFF1D"/>
     <w:multiLevelType w:val="multilevel"/>
@@ -4049,16 +3762,8 @@
 </w:numbering>
 </file>
 
-<file path=word/people.xml><?xml version="1.0" encoding="utf-8"?>
-<w15:people xmlns:wpc="http://schemas.microsoft.com/office/word/2010/wordprocessingCanvas" xmlns:cx="http://schemas.microsoft.com/office/drawing/2014/chartex" xmlns:cx1="http://schemas.microsoft.com/office/drawing/2015/9/8/chartex" xmlns:cx2="http://schemas.microsoft.com/office/drawing/2015/10/21/chartex" xmlns:cx3="http://schemas.microsoft.com/office/drawing/2016/5/9/chartex" xmlns:cx4="http://schemas.microsoft.com/office/drawing/2016/5/10/chartex" xmlns:cx5="http://schemas.microsoft.com/office/drawing/2016/5/11/chartex" xmlns:cx6="http://schemas.microsoft.com/office/drawing/2016/5/12/chartex" xmlns:cx7="http://schemas.microsoft.com/office/drawing/2016/5/13/chartex" xmlns:cx8="http://schemas.microsoft.com/office/drawing/2016/5/14/chartex" xmlns:mc="http://schemas.openxmlformats.org/markup-compatibility/2006" xmlns:aink="http://schemas.microsoft.com/office/drawing/2016/ink" xmlns:am3d="http://schemas.microsoft.com/office/drawing/2017/model3d" xmlns:o="urn:schemas-microsoft-com:office:office" xmlns:oel="http://schemas.microsoft.com/office/2019/extlst" xmlns:r="http://schemas.openxmlformats.org/officeDocument/2006/relationships" xmlns:m="http://schemas.openxmlformats.org/officeDocument/2006/math" xmlns:v="urn:schemas-microsoft-com:vml" xmlns:wp14="http://schemas.microsoft.com/office/word/2010/wordprocessingDrawing" xmlns:wp="http://schemas.openxmlformats.org/drawingml/2006/wordprocessingDrawing" xmlns:w10="urn:schemas-microsoft-com:office:word" xmlns:w="http://schemas.openxmlformats.org/wordprocessingml/2006/main" xmlns:w14="http://schemas.microsoft.com/office/word/2010/wordml" xmlns:w15="http://schemas.microsoft.com/office/word/2012/wordml" xmlns:w16cex="http://schemas.microsoft.com/office/word/2018/wordml/cex" xmlns:w16cid="http://schemas.microsoft.com/office/word/2016/wordml/cid" xmlns:w16="http://schemas.microsoft.com/office/word/2018/wordml" xmlns:w16du="http://schemas.microsoft.com/office/word/2023/wordml/word16du" xmlns:w16sdtdh="http://schemas.microsoft.com/office/word/2020/wordml/sdtdatahash" xmlns:w16sdtfl="http://schemas.microsoft.com/office/word/2024/wordml/sdtformatlock" xmlns:w16se="http://schemas.microsoft.com/office/word/2015/wordml/symex" xmlns:wpg="http://schemas.microsoft.com/office/word/2010/wordprocessingGroup" xmlns:wpi="http://schemas.microsoft.com/office/word/2010/wordprocessingInk" xmlns:wne="http://schemas.microsoft.com/office/word/2006/wordml" xmlns:wps="http://schemas.microsoft.com/office/word/2010/wordprocessingShape" mc:Ignorable="w14 w15 w16se w16cid w16 w16cex w16sdtdh w16sdtfl w16du wp14">
-  <w15:person w15:author="Jaeger, Florian">
-    <w15:presenceInfo w15:providerId="AD" w15:userId="S::fjaeger@ur.rochester.edu::0d0acd91-09a2-4ddb-a934-22efc544688e"/>
-  </w15:person>
-</w15:people>
-</file>
-
 <file path=word/styles.xml><?xml version="1.0" encoding="utf-8"?>
-<w:styles xmlns:mc="http://schemas.openxmlformats.org/markup-compatibility/2006" xmlns:r="http://schemas.openxmlformats.org/officeDocument/2006/relationships" xmlns:w="http://schemas.openxmlformats.org/wordprocessingml/2006/main" xmlns:w14="http://schemas.microsoft.com/office/word/2010/wordml" xmlns:w15="http://schemas.microsoft.com/office/word/2012/wordml" xmlns:w16cex="http://schemas.microsoft.com/office/word/2018/wordml/cex" xmlns:w16cid="http://schemas.microsoft.com/office/word/2016/wordml/cid" xmlns:w16="http://schemas.microsoft.com/office/word/2018/wordml" xmlns:w16du="http://schemas.microsoft.com/office/word/2023/wordml/word16du" xmlns:w16sdtdh="http://schemas.microsoft.com/office/word/2020/wordml/sdtdatahash" xmlns:w16sdtfl="http://schemas.microsoft.com/office/word/2024/wordml/sdtformatlock" xmlns:w16se="http://schemas.microsoft.com/office/word/2015/wordml/symex" mc:Ignorable="w14 w15 w16se w16cid w16 w16cex w16sdtdh w16sdtfl w16du">
+<w:styles xmlns:mc="http://schemas.openxmlformats.org/markup-compatibility/2006" xmlns:r="http://schemas.openxmlformats.org/officeDocument/2006/relationships" xmlns:w="http://schemas.openxmlformats.org/wordprocessingml/2006/main" xmlns:w14="http://schemas.microsoft.com/office/word/2010/wordml" xmlns:w15="http://schemas.microsoft.com/office/word/2012/wordml" xmlns:w16cex="http://schemas.microsoft.com/office/word/2018/wordml/cex" xmlns:w16cid="http://schemas.microsoft.com/office/word/2016/wordml/cid" xmlns:w16="http://schemas.microsoft.com/office/word/2018/wordml" xmlns:w16du="http://schemas.microsoft.com/office/word/2023/wordml/word16du" xmlns:w16sdtdh="http://schemas.microsoft.com/office/word/2020/wordml/sdtdatahash" xmlns:w16se="http://schemas.microsoft.com/office/word/2015/wordml/symex" mc:Ignorable="w14 w15 w16se w16cid w16 w16cex w16sdtdh w16du">
   <w:docDefaults>
     <w:rPrDefault>
       <w:rPr>

</xml_diff>